<commit_message>
Se finaliza el informe de la actividad 1
</commit_message>
<xml_diff>
--- a/Oña_Franklin_Act1.docx
+++ b/Oña_Franklin_Act1.docx
@@ -823,7 +823,7 @@
           <w:kern w:val="24"/>
           <w:lang w:val="es-ES_tradnl"/>
         </w:rPr>
-        <w:t xml:space="preserve">2025 </w:t>
+        <w:t>202</w:t>
       </w:r>
       <w:r>
         <w:rPr>
@@ -832,7 +832,7 @@
           <w:kern w:val="24"/>
           <w:lang w:val="es-ES_tradnl"/>
         </w:rPr>
-        <w:t>-</w:t>
+        <w:t>6</w:t>
       </w:r>
       <w:r>
         <w:rPr>
@@ -841,7 +841,7 @@
           <w:kern w:val="24"/>
           <w:lang w:val="es-ES_tradnl"/>
         </w:rPr>
-        <w:t xml:space="preserve"> ENERO</w:t>
+        <w:t xml:space="preserve"> </w:t>
       </w:r>
       <w:r>
         <w:rPr>
@@ -850,7 +850,7 @@
           <w:kern w:val="24"/>
           <w:lang w:val="es-ES_tradnl"/>
         </w:rPr>
-        <w:t xml:space="preserve"> 202</w:t>
+        <w:t>-</w:t>
       </w:r>
       <w:r>
         <w:rPr>
@@ -859,7 +859,25 @@
           <w:kern w:val="24"/>
           <w:lang w:val="es-ES_tradnl"/>
         </w:rPr>
-        <w:t>6</w:t>
+        <w:t xml:space="preserve"> ENERO</w:t>
+      </w:r>
+      <w:r>
+        <w:rPr>
+          <w:rFonts w:ascii="Arial" w:hAnsi="Arial" w:cs="Arial"/>
+          <w:b/>
+          <w:kern w:val="24"/>
+          <w:lang w:val="es-ES_tradnl"/>
+        </w:rPr>
+        <w:t xml:space="preserve"> 202</w:t>
+      </w:r>
+      <w:r>
+        <w:rPr>
+          <w:rFonts w:ascii="Arial" w:hAnsi="Arial" w:cs="Arial"/>
+          <w:b/>
+          <w:kern w:val="24"/>
+          <w:lang w:val="es-ES_tradnl"/>
+        </w:rPr>
+        <w:t>7</w:t>
       </w:r>
     </w:p>
     <w:p>
@@ -973,13 +991,23 @@
           </wp:anchor>
         </w:drawing>
       </w:r>
+      <w:proofErr w:type="gramStart"/>
       <w:r>
         <w:rPr>
           <w:rFonts w:ascii="Arial" w:hAnsi="Arial" w:cs="Arial"/>
           <w:b/>
           <w:sz w:val="28"/>
         </w:rPr>
-        <w:t xml:space="preserve">Actividades a desarrollar en la </w:t>
+        <w:t>Actividades a desarrollar</w:t>
+      </w:r>
+      <w:proofErr w:type="gramEnd"/>
+      <w:r>
+        <w:rPr>
+          <w:rFonts w:ascii="Arial" w:hAnsi="Arial" w:cs="Arial"/>
+          <w:b/>
+          <w:sz w:val="28"/>
+        </w:rPr>
+        <w:t xml:space="preserve"> en la </w:t>
       </w:r>
       <w:r>
         <w:rPr>
@@ -1527,8 +1555,8 @@
         <w:tblLook w:val="04A0" w:firstRow="1" w:lastRow="0" w:firstColumn="1" w:lastColumn="0" w:noHBand="0" w:noVBand="1"/>
       </w:tblPr>
       <w:tblGrid>
-        <w:gridCol w:w="2574"/>
-        <w:gridCol w:w="5920"/>
+        <w:gridCol w:w="2671"/>
+        <w:gridCol w:w="6345"/>
       </w:tblGrid>
       <w:tr>
         <w:tc>
@@ -1808,6 +1836,26 @@
           <w:lang w:eastAsia="es-EC"/>
         </w:rPr>
       </w:pPr>
+    </w:p>
+    <w:p>
+      <w:pPr>
+        <w:widowControl w:val="0"/>
+        <w:pBdr>
+          <w:top w:val="nil"/>
+          <w:left w:val="nil"/>
+          <w:bottom w:val="nil"/>
+          <w:right w:val="nil"/>
+          <w:between w:val="nil"/>
+        </w:pBdr>
+        <w:spacing w:after="0" w:line="360" w:lineRule="auto"/>
+        <w:jc w:val="both"/>
+        <w:rPr>
+          <w:rFonts w:ascii="Arial" w:hAnsi="Arial" w:cs="Arial"/>
+          <w:b/>
+          <w:bCs/>
+          <w:lang w:eastAsia="es-EC"/>
+        </w:rPr>
+      </w:pPr>
       <w:r>
         <w:rPr>
           <w:rFonts w:ascii="Arial" w:hAnsi="Arial" w:cs="Arial"/>
@@ -1841,7 +1889,7 @@
       </w:tblPr>
       <w:tblGrid>
         <w:gridCol w:w="974"/>
-        <w:gridCol w:w="7520"/>
+        <w:gridCol w:w="8042"/>
       </w:tblGrid>
       <w:tr>
         <w:tc>
@@ -2354,7 +2402,7 @@
       </w:tblPr>
       <w:tblGrid>
         <w:gridCol w:w="974"/>
-        <w:gridCol w:w="7520"/>
+        <w:gridCol w:w="8042"/>
       </w:tblGrid>
       <w:tr>
         <w:tc>
@@ -2676,7 +2724,25 @@
           <w:bCs/>
           <w:lang w:eastAsia="es-EC"/>
         </w:rPr>
-        <w:t>diseño del sistema.</w:t>
+        <w:t>D</w:t>
+      </w:r>
+      <w:r>
+        <w:rPr>
+          <w:rFonts w:ascii="Arial" w:hAnsi="Arial" w:cs="Arial"/>
+          <w:b/>
+          <w:bCs/>
+          <w:lang w:eastAsia="es-EC"/>
+        </w:rPr>
+        <w:t>iseño del sistema</w:t>
+      </w:r>
+      <w:r>
+        <w:rPr>
+          <w:rFonts w:ascii="Arial" w:hAnsi="Arial" w:cs="Arial"/>
+          <w:b/>
+          <w:bCs/>
+          <w:lang w:eastAsia="es-EC"/>
+        </w:rPr>
+        <w:t>.</w:t>
       </w:r>
     </w:p>
     <w:p>
@@ -2752,6 +2818,74 @@
         </w:rPr>
         <w:t>, develop y ramas feature/ para avances).</w:t>
       </w:r>
+      <w:sdt>
+        <w:sdtPr>
+          <w:rPr>
+            <w:rFonts w:ascii="Arial" w:hAnsi="Arial" w:cs="Arial"/>
+            <w:b/>
+            <w:bCs/>
+            <w:lang w:eastAsia="es-EC"/>
+          </w:rPr>
+          <w:id w:val="-2079594957"/>
+          <w:citation/>
+        </w:sdtPr>
+        <w:sdtContent>
+          <w:r>
+            <w:rPr>
+              <w:rFonts w:ascii="Arial" w:hAnsi="Arial" w:cs="Arial"/>
+              <w:b/>
+              <w:bCs/>
+              <w:lang w:eastAsia="es-EC"/>
+            </w:rPr>
+            <w:fldChar w:fldCharType="begin"/>
+          </w:r>
+          <w:r>
+            <w:rPr>
+              <w:rFonts w:ascii="Arial" w:hAnsi="Arial" w:cs="Arial"/>
+              <w:b/>
+              <w:bCs/>
+              <w:lang w:eastAsia="es-EC"/>
+            </w:rPr>
+            <w:instrText xml:space="preserve">CITATION Sco \l 12298 </w:instrText>
+          </w:r>
+          <w:r>
+            <w:rPr>
+              <w:rFonts w:ascii="Arial" w:hAnsi="Arial" w:cs="Arial"/>
+              <w:b/>
+              <w:bCs/>
+              <w:lang w:eastAsia="es-EC"/>
+            </w:rPr>
+            <w:fldChar w:fldCharType="separate"/>
+          </w:r>
+          <w:r>
+            <w:rPr>
+              <w:rFonts w:ascii="Arial" w:hAnsi="Arial" w:cs="Arial"/>
+              <w:b/>
+              <w:bCs/>
+              <w:noProof/>
+              <w:lang w:eastAsia="es-EC"/>
+            </w:rPr>
+            <w:t xml:space="preserve"> </w:t>
+          </w:r>
+          <w:r>
+            <w:rPr>
+              <w:rFonts w:ascii="Arial" w:hAnsi="Arial" w:cs="Arial"/>
+              <w:noProof/>
+              <w:lang w:eastAsia="es-EC"/>
+            </w:rPr>
+            <w:t>[1]</w:t>
+          </w:r>
+          <w:r>
+            <w:rPr>
+              <w:rFonts w:ascii="Arial" w:hAnsi="Arial" w:cs="Arial"/>
+              <w:b/>
+              <w:bCs/>
+              <w:lang w:eastAsia="es-EC"/>
+            </w:rPr>
+            <w:fldChar w:fldCharType="end"/>
+          </w:r>
+        </w:sdtContent>
+      </w:sdt>
     </w:p>
     <w:p>
       <w:pPr>
@@ -2797,7 +2931,7 @@
         <mc:AlternateContent>
           <mc:Choice Requires="wps">
             <w:drawing>
-              <wp:anchor distT="0" distB="0" distL="114300" distR="114300" simplePos="0" relativeHeight="251668480" behindDoc="0" locked="0" layoutInCell="1" allowOverlap="1" wp14:anchorId="3387E7B6" wp14:editId="7FD0F573">
+              <wp:anchor distT="0" distB="0" distL="114300" distR="114300" simplePos="0" relativeHeight="251667456" behindDoc="0" locked="0" layoutInCell="1" allowOverlap="1" wp14:anchorId="0BEB8784" wp14:editId="1CA668AA">
                 <wp:simplePos x="0" y="0"/>
                 <wp:positionH relativeFrom="column">
                   <wp:posOffset>3762375</wp:posOffset>
@@ -2884,7 +3018,7 @@
           </mc:Choice>
           <mc:Fallback>
             <w:pict>
-              <v:shapetype w14:anchorId="3387E7B6" id="_x0000_t47" coordsize="21600,21600" o:spt="47" adj="-8280,24300,-1800,4050" path="m@0@1l@2@3nfem,l21600,r,21600l,21600xe">
+              <v:shapetype w14:anchorId="0BEB8784" id="_x0000_t47" coordsize="21600,21600" o:spt="47" adj="-8280,24300,-1800,4050" path="m@0@1l@2@3nfem,l21600,r,21600l,21600xe">
                 <v:stroke joinstyle="miter"/>
                 <v:formulas>
                   <v:f eqn="val #0"/>
@@ -2899,7 +3033,7 @@
                 </v:handles>
                 <o:callout v:ext="edit" type="oneSegment" on="t"/>
               </v:shapetype>
-              <v:shape id="Globo: línea 3" o:spid="_x0000_s1026" type="#_x0000_t47" style="position:absolute;left:0;text-align:left;margin-left:296.25pt;margin-top:47pt;width:1in;height:48.2pt;z-index:251668480;visibility:visible;mso-wrap-style:square;mso-wrap-distance-left:9pt;mso-wrap-distance-top:0;mso-wrap-distance-right:9pt;mso-wrap-distance-bottom:0;mso-position-horizontal:absolute;mso-position-horizontal-relative:text;mso-position-vertical:absolute;mso-position-vertical-relative:text;v-text-anchor:middle" o:gfxdata="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" adj="-32040,17578" fillcolor="#92d050" strokecolor="black [3213]" strokeweight=".5pt">
+              <v:shape id="Globo: línea 3" o:spid="_x0000_s1026" type="#_x0000_t47" style="position:absolute;left:0;text-align:left;margin-left:296.25pt;margin-top:47pt;width:1in;height:48.2pt;z-index:251667456;visibility:visible;mso-wrap-style:square;mso-wrap-distance-left:9pt;mso-wrap-distance-top:0;mso-wrap-distance-right:9pt;mso-wrap-distance-bottom:0;mso-position-horizontal:absolute;mso-position-horizontal-relative:text;mso-position-vertical:absolute;mso-position-vertical-relative:text;v-text-anchor:middle" o:gfxdata="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" adj="-32040,17578" fillcolor="#92d050" strokecolor="black [3213]" strokeweight=".5pt">
                 <v:textbox>
                   <w:txbxContent>
                     <w:p>
@@ -2933,7 +3067,7 @@
         <mc:AlternateContent>
           <mc:Choice Requires="wps">
             <w:drawing>
-              <wp:anchor distT="0" distB="0" distL="114300" distR="114300" simplePos="0" relativeHeight="251667456" behindDoc="0" locked="0" layoutInCell="1" allowOverlap="1" wp14:anchorId="0E652FCC" wp14:editId="5AE751B1">
+              <wp:anchor distT="0" distB="0" distL="114300" distR="114300" simplePos="0" relativeHeight="251666432" behindDoc="0" locked="0" layoutInCell="1" allowOverlap="1" wp14:anchorId="5B160B22" wp14:editId="0BC2E1BF">
                 <wp:simplePos x="0" y="0"/>
                 <wp:positionH relativeFrom="column">
                   <wp:posOffset>817245</wp:posOffset>
@@ -2998,7 +3132,7 @@
           </mc:Choice>
           <mc:Fallback>
             <w:pict>
-              <v:rect w14:anchorId="4C5EAEFE" id="Rectángulo 2" o:spid="_x0000_s1026" style="position:absolute;margin-left:64.35pt;margin-top:84.8pt;width:117pt;height:8.4pt;z-index:251667456;visibility:visible;mso-wrap-style:square;mso-height-percent:0;mso-wrap-distance-left:9pt;mso-wrap-distance-top:0;mso-wrap-distance-right:9pt;mso-wrap-distance-bottom:0;mso-position-horizontal:absolute;mso-position-horizontal-relative:text;mso-position-vertical:absolute;mso-position-vertical-relative:text;mso-height-percent:0;mso-height-relative:margin;v-text-anchor:middle" o:gfxdata="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" filled="f" strokecolor="#c00000" strokeweight="1pt"/>
+              <v:rect w14:anchorId="31B75069" id="Rectángulo 2" o:spid="_x0000_s1026" style="position:absolute;margin-left:64.35pt;margin-top:84.8pt;width:117pt;height:8.4pt;z-index:251666432;visibility:visible;mso-wrap-style:square;mso-height-percent:0;mso-wrap-distance-left:9pt;mso-wrap-distance-top:0;mso-wrap-distance-right:9pt;mso-wrap-distance-bottom:0;mso-position-horizontal:absolute;mso-position-horizontal-relative:text;mso-position-vertical:absolute;mso-position-vertical-relative:text;mso-height-percent:0;mso-height-relative:margin;v-text-anchor:middle" o:gfxdata="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" filled="f" strokecolor="#c00000" strokeweight="1pt"/>
             </w:pict>
           </mc:Fallback>
         </mc:AlternateContent>
@@ -3010,7 +3144,7 @@
           <w:lang w:eastAsia="es-EC"/>
         </w:rPr>
         <w:drawing>
-          <wp:inline distT="0" distB="0" distL="0" distR="0" wp14:anchorId="7735D00F" wp14:editId="667BCAB4">
+          <wp:inline distT="0" distB="0" distL="0" distR="0" wp14:anchorId="398DA940" wp14:editId="348A3943">
             <wp:extent cx="3126320" cy="2448000"/>
             <wp:effectExtent l="0" t="0" r="0" b="0"/>
             <wp:docPr id="1134284852" name="Imagen 1"/>
@@ -3080,7 +3214,7 @@
         </w:rPr>
         <w:lastRenderedPageBreak/>
         <w:drawing>
-          <wp:inline distT="0" distB="0" distL="0" distR="0" wp14:anchorId="361C53F4" wp14:editId="77CD7514">
+          <wp:inline distT="0" distB="0" distL="0" distR="0" wp14:anchorId="441F715E" wp14:editId="3F159050">
             <wp:extent cx="2223429" cy="1080000"/>
             <wp:effectExtent l="0" t="0" r="5715" b="6350"/>
             <wp:docPr id="264481576" name="Imagen 1"/>
@@ -3149,7 +3283,7 @@
           <w:lang w:eastAsia="es-EC"/>
         </w:rPr>
         <w:drawing>
-          <wp:inline distT="0" distB="0" distL="0" distR="0" wp14:anchorId="20117E5F" wp14:editId="5A29D0F6">
+          <wp:inline distT="0" distB="0" distL="0" distR="0" wp14:anchorId="62181478" wp14:editId="7B081DF1">
             <wp:extent cx="5400040" cy="152400"/>
             <wp:effectExtent l="19050" t="19050" r="10160" b="19050"/>
             <wp:docPr id="153664435" name="Imagen 1"/>
@@ -3284,7 +3418,7 @@
         <mc:AlternateContent>
           <mc:Choice Requires="wps">
             <w:drawing>
-              <wp:anchor distT="0" distB="0" distL="114300" distR="114300" simplePos="0" relativeHeight="251669504" behindDoc="0" locked="0" layoutInCell="1" allowOverlap="1" wp14:anchorId="11424E07" wp14:editId="37B82228">
+              <wp:anchor distT="0" distB="0" distL="114300" distR="114300" simplePos="0" relativeHeight="251669504" behindDoc="0" locked="0" layoutInCell="1" allowOverlap="1" wp14:anchorId="07FB1FA4" wp14:editId="7EF110CD">
                 <wp:simplePos x="0" y="0"/>
                 <wp:positionH relativeFrom="column">
                   <wp:posOffset>4474845</wp:posOffset>
@@ -3352,7 +3486,7 @@
           </mc:Choice>
           <mc:Fallback>
             <w:pict>
-              <v:rect w14:anchorId="422E91CA" id="Rectángulo 2" o:spid="_x0000_s1026" style="position:absolute;margin-left:352.35pt;margin-top:17.2pt;width:70.2pt;height:13.2pt;z-index:251669504;visibility:visible;mso-wrap-style:square;mso-width-percent:0;mso-height-percent:0;mso-wrap-distance-left:9pt;mso-wrap-distance-top:0;mso-wrap-distance-right:9pt;mso-wrap-distance-bottom:0;mso-position-horizontal:absolute;mso-position-horizontal-relative:text;mso-position-vertical:absolute;mso-position-vertical-relative:text;mso-width-percent:0;mso-height-percent:0;mso-width-relative:margin;mso-height-relative:margin;v-text-anchor:middle" o:gfxdata="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" filled="f" strokecolor="#c00000" strokeweight="1pt"/>
+              <v:rect w14:anchorId="594EA261" id="Rectángulo 2" o:spid="_x0000_s1026" style="position:absolute;margin-left:352.35pt;margin-top:17.2pt;width:70.2pt;height:13.2pt;z-index:251669504;visibility:visible;mso-wrap-style:square;mso-width-percent:0;mso-height-percent:0;mso-wrap-distance-left:9pt;mso-wrap-distance-top:0;mso-wrap-distance-right:9pt;mso-wrap-distance-bottom:0;mso-position-horizontal:absolute;mso-position-horizontal-relative:text;mso-position-vertical:absolute;mso-position-vertical-relative:text;mso-width-percent:0;mso-height-percent:0;mso-width-relative:margin;mso-height-relative:margin;v-text-anchor:middle" o:gfxdata="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" filled="f" strokecolor="#c00000" strokeweight="1pt"/>
             </w:pict>
           </mc:Fallback>
         </mc:AlternateContent>
@@ -3364,7 +3498,7 @@
           <w:lang w:eastAsia="es-EC"/>
         </w:rPr>
         <w:drawing>
-          <wp:inline distT="0" distB="0" distL="0" distR="0" wp14:anchorId="2E033A8A" wp14:editId="4CE98A16">
+          <wp:inline distT="0" distB="0" distL="0" distR="0" wp14:anchorId="5DC07D78" wp14:editId="7FA77BB6">
             <wp:extent cx="5400040" cy="2395220"/>
             <wp:effectExtent l="19050" t="19050" r="10160" b="24130"/>
             <wp:docPr id="1659096317" name="Imagen 1"/>
@@ -3515,7 +3649,7 @@
           <w:lang w:eastAsia="es-EC"/>
         </w:rPr>
         <w:drawing>
-          <wp:inline distT="0" distB="0" distL="0" distR="0" wp14:anchorId="3663528C" wp14:editId="1B62958F">
+          <wp:inline distT="0" distB="0" distL="0" distR="0" wp14:anchorId="2B47F871" wp14:editId="6F5063CC">
             <wp:extent cx="5400040" cy="438150"/>
             <wp:effectExtent l="0" t="0" r="0" b="0"/>
             <wp:docPr id="564041235" name="Imagen 1"/>
@@ -3575,7 +3709,7 @@
           <w:lang w:eastAsia="es-EC"/>
         </w:rPr>
         <w:drawing>
-          <wp:inline distT="0" distB="0" distL="0" distR="0" wp14:anchorId="30105A7A" wp14:editId="7E6BD7C1">
+          <wp:inline distT="0" distB="0" distL="0" distR="0" wp14:anchorId="77C930E7" wp14:editId="2909D290">
             <wp:extent cx="5400040" cy="334645"/>
             <wp:effectExtent l="0" t="0" r="0" b="8255"/>
             <wp:docPr id="1196161567" name="Imagen 1"/>
@@ -3678,7 +3812,7 @@
           <w:lang w:eastAsia="es-EC"/>
         </w:rPr>
         <w:drawing>
-          <wp:inline distT="0" distB="0" distL="0" distR="0" wp14:anchorId="0A40F45D" wp14:editId="78EB40F7">
+          <wp:inline distT="0" distB="0" distL="0" distR="0" wp14:anchorId="3A4F5AC2" wp14:editId="0C06FD72">
             <wp:extent cx="5400040" cy="508000"/>
             <wp:effectExtent l="0" t="0" r="0" b="6350"/>
             <wp:docPr id="1418902781" name="Imagen 1"/>
@@ -3820,7 +3954,7 @@
         <mc:AlternateContent>
           <mc:Choice Requires="wps">
             <w:drawing>
-              <wp:anchor distT="0" distB="0" distL="114300" distR="114300" simplePos="0" relativeHeight="251670528" behindDoc="0" locked="0" layoutInCell="1" allowOverlap="1" wp14:anchorId="742831DF" wp14:editId="450E38D0">
+              <wp:anchor distT="0" distB="0" distL="114300" distR="114300" simplePos="0" relativeHeight="251671552" behindDoc="0" locked="0" layoutInCell="1" allowOverlap="1" wp14:anchorId="692BFFFF" wp14:editId="0055B748">
                 <wp:simplePos x="0" y="0"/>
                 <wp:positionH relativeFrom="column">
                   <wp:posOffset>3225165</wp:posOffset>
@@ -3888,7 +4022,7 @@
           </mc:Choice>
           <mc:Fallback>
             <w:pict>
-              <v:rect w14:anchorId="40FA98E6" id="Rectángulo 2" o:spid="_x0000_s1026" style="position:absolute;margin-left:253.95pt;margin-top:57.65pt;width:70.2pt;height:13.2pt;z-index:251670528;visibility:visible;mso-wrap-style:square;mso-width-percent:0;mso-height-percent:0;mso-wrap-distance-left:9pt;mso-wrap-distance-top:0;mso-wrap-distance-right:9pt;mso-wrap-distance-bottom:0;mso-position-horizontal:absolute;mso-position-horizontal-relative:text;mso-position-vertical:absolute;mso-position-vertical-relative:text;mso-width-percent:0;mso-height-percent:0;mso-width-relative:margin;mso-height-relative:margin;v-text-anchor:middle" o:gfxdata="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" filled="f" strokecolor="#c00000" strokeweight="1pt"/>
+              <v:rect w14:anchorId="525915BF" id="Rectángulo 2" o:spid="_x0000_s1026" style="position:absolute;margin-left:253.95pt;margin-top:57.65pt;width:70.2pt;height:13.2pt;z-index:251671552;visibility:visible;mso-wrap-style:square;mso-width-percent:0;mso-height-percent:0;mso-wrap-distance-left:9pt;mso-wrap-distance-top:0;mso-wrap-distance-right:9pt;mso-wrap-distance-bottom:0;mso-position-horizontal:absolute;mso-position-horizontal-relative:text;mso-position-vertical:absolute;mso-position-vertical-relative:text;mso-width-percent:0;mso-height-percent:0;mso-width-relative:margin;mso-height-relative:margin;v-text-anchor:middle" o:gfxdata="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" filled="f" strokecolor="#c00000" strokeweight="1pt"/>
             </w:pict>
           </mc:Fallback>
         </mc:AlternateContent>
@@ -3900,7 +4034,7 @@
           <w:lang w:eastAsia="es-EC"/>
         </w:rPr>
         <w:drawing>
-          <wp:inline distT="0" distB="0" distL="0" distR="0" wp14:anchorId="4DA666B1" wp14:editId="03BE7A0F">
+          <wp:inline distT="0" distB="0" distL="0" distR="0" wp14:anchorId="44E5645E" wp14:editId="3755A2FF">
             <wp:extent cx="2537460" cy="1866900"/>
             <wp:effectExtent l="19050" t="19050" r="15240" b="19050"/>
             <wp:docPr id="200668397" name="Imagen 1"/>
@@ -3960,7 +4094,7 @@
           <w:lang w:eastAsia="es-EC"/>
         </w:rPr>
         <w:drawing>
-          <wp:inline distT="0" distB="0" distL="0" distR="0" wp14:anchorId="3D5D3830" wp14:editId="3C415FC1">
+          <wp:inline distT="0" distB="0" distL="0" distR="0" wp14:anchorId="0E853A0E" wp14:editId="1ADF109D">
             <wp:extent cx="2636955" cy="1872000"/>
             <wp:effectExtent l="19050" t="19050" r="11430" b="13970"/>
             <wp:docPr id="1520726559" name="Imagen 1"/>
@@ -4119,7 +4253,7 @@
         <mc:AlternateContent>
           <mc:Choice Requires="wps">
             <w:drawing>
-              <wp:anchor distT="0" distB="0" distL="114300" distR="114300" simplePos="0" relativeHeight="251671552" behindDoc="0" locked="0" layoutInCell="1" allowOverlap="1" wp14:anchorId="3303528B" wp14:editId="218279C3">
+              <wp:anchor distT="0" distB="0" distL="114300" distR="114300" simplePos="0" relativeHeight="251673600" behindDoc="0" locked="0" layoutInCell="1" allowOverlap="1" wp14:anchorId="5321010D" wp14:editId="125AD6AB">
                 <wp:simplePos x="0" y="0"/>
                 <wp:positionH relativeFrom="column">
                   <wp:posOffset>626745</wp:posOffset>
@@ -4187,7 +4321,7 @@
           </mc:Choice>
           <mc:Fallback>
             <w:pict>
-              <v:rect w14:anchorId="025AF27D" id="Rectángulo 2" o:spid="_x0000_s1026" style="position:absolute;margin-left:49.35pt;margin-top:31.85pt;width:138pt;height:13.8pt;z-index:251671552;visibility:visible;mso-wrap-style:square;mso-width-percent:0;mso-height-percent:0;mso-wrap-distance-left:9pt;mso-wrap-distance-top:0;mso-wrap-distance-right:9pt;mso-wrap-distance-bottom:0;mso-position-horizontal:absolute;mso-position-horizontal-relative:text;mso-position-vertical:absolute;mso-position-vertical-relative:text;mso-width-percent:0;mso-height-percent:0;mso-width-relative:margin;mso-height-relative:margin;v-text-anchor:middle" o:gfxdata="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" filled="f" strokecolor="#c00000" strokeweight="1pt"/>
+              <v:rect w14:anchorId="57669207" id="Rectángulo 2" o:spid="_x0000_s1026" style="position:absolute;margin-left:49.35pt;margin-top:31.85pt;width:138pt;height:13.8pt;z-index:251673600;visibility:visible;mso-wrap-style:square;mso-width-percent:0;mso-height-percent:0;mso-wrap-distance-left:9pt;mso-wrap-distance-top:0;mso-wrap-distance-right:9pt;mso-wrap-distance-bottom:0;mso-position-horizontal:absolute;mso-position-horizontal-relative:text;mso-position-vertical:absolute;mso-position-vertical-relative:text;mso-width-percent:0;mso-height-percent:0;mso-width-relative:margin;mso-height-relative:margin;v-text-anchor:middle" o:gfxdata="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" filled="f" strokecolor="#c00000" strokeweight="1pt"/>
             </w:pict>
           </mc:Fallback>
         </mc:AlternateContent>
@@ -4199,7 +4333,7 @@
           <w:lang w:eastAsia="es-EC"/>
         </w:rPr>
         <w:drawing>
-          <wp:inline distT="0" distB="0" distL="0" distR="0" wp14:anchorId="2585EA75" wp14:editId="1D806253">
+          <wp:inline distT="0" distB="0" distL="0" distR="0" wp14:anchorId="3E0876C4" wp14:editId="61650EEC">
             <wp:extent cx="5400040" cy="2530475"/>
             <wp:effectExtent l="19050" t="19050" r="10160" b="22225"/>
             <wp:docPr id="1481716031" name="Imagen 1"/>
@@ -4291,6 +4425,74 @@
         </w:rPr>
         <w:t>DESARROLLO DE SISTEMAS INFORMÁTICOS</w:t>
       </w:r>
+      <w:sdt>
+        <w:sdtPr>
+          <w:rPr>
+            <w:rFonts w:ascii="Arial" w:hAnsi="Arial" w:cs="Arial"/>
+            <w:b/>
+            <w:bCs/>
+            <w:lang w:eastAsia="es-EC"/>
+          </w:rPr>
+          <w:id w:val="-1330286136"/>
+          <w:citation/>
+        </w:sdtPr>
+        <w:sdtContent>
+          <w:r>
+            <w:rPr>
+              <w:rFonts w:ascii="Arial" w:hAnsi="Arial" w:cs="Arial"/>
+              <w:b/>
+              <w:bCs/>
+              <w:lang w:eastAsia="es-EC"/>
+            </w:rPr>
+            <w:fldChar w:fldCharType="begin"/>
+          </w:r>
+          <w:r>
+            <w:rPr>
+              <w:rFonts w:ascii="Arial" w:hAnsi="Arial" w:cs="Arial"/>
+              <w:b/>
+              <w:bCs/>
+              <w:lang w:eastAsia="es-EC"/>
+            </w:rPr>
+            <w:instrText xml:space="preserve"> CITATION Git \l 12298 </w:instrText>
+          </w:r>
+          <w:r>
+            <w:rPr>
+              <w:rFonts w:ascii="Arial" w:hAnsi="Arial" w:cs="Arial"/>
+              <w:b/>
+              <w:bCs/>
+              <w:lang w:eastAsia="es-EC"/>
+            </w:rPr>
+            <w:fldChar w:fldCharType="separate"/>
+          </w:r>
+          <w:r>
+            <w:rPr>
+              <w:rFonts w:ascii="Arial" w:hAnsi="Arial" w:cs="Arial"/>
+              <w:b/>
+              <w:bCs/>
+              <w:noProof/>
+              <w:lang w:eastAsia="es-EC"/>
+            </w:rPr>
+            <w:t xml:space="preserve"> </w:t>
+          </w:r>
+          <w:r>
+            <w:rPr>
+              <w:rFonts w:ascii="Arial" w:hAnsi="Arial" w:cs="Arial"/>
+              <w:noProof/>
+              <w:lang w:eastAsia="es-EC"/>
+            </w:rPr>
+            <w:t>[2]</w:t>
+          </w:r>
+          <w:r>
+            <w:rPr>
+              <w:rFonts w:ascii="Arial" w:hAnsi="Arial" w:cs="Arial"/>
+              <w:b/>
+              <w:bCs/>
+              <w:lang w:eastAsia="es-EC"/>
+            </w:rPr>
+            <w:fldChar w:fldCharType="end"/>
+          </w:r>
+        </w:sdtContent>
+      </w:sdt>
     </w:p>
     <w:p>
       <w:pPr>
@@ -4360,7 +4562,7 @@
           <w:lang w:eastAsia="es-EC"/>
         </w:rPr>
         <w:drawing>
-          <wp:inline distT="0" distB="0" distL="0" distR="0" wp14:anchorId="6148B921" wp14:editId="3DF322EC">
+          <wp:inline distT="0" distB="0" distL="0" distR="0" wp14:anchorId="5D3686A3" wp14:editId="57A8AF9E">
             <wp:extent cx="5400040" cy="377190"/>
             <wp:effectExtent l="0" t="0" r="0" b="3810"/>
             <wp:docPr id="1296102642" name="Imagen 1"/>
@@ -4424,7 +4626,7 @@
           <w:lang w:eastAsia="es-EC"/>
         </w:rPr>
         <w:drawing>
-          <wp:inline distT="0" distB="0" distL="0" distR="0" wp14:anchorId="338F7BD8" wp14:editId="228EEB95">
+          <wp:inline distT="0" distB="0" distL="0" distR="0" wp14:anchorId="46CAE678" wp14:editId="7F9F7BE7">
             <wp:extent cx="5400040" cy="334010"/>
             <wp:effectExtent l="0" t="0" r="0" b="8890"/>
             <wp:docPr id="150078108" name="Imagen 1"/>
@@ -4489,7 +4691,7 @@
         </w:rPr>
         <w:lastRenderedPageBreak/>
         <w:drawing>
-          <wp:inline distT="0" distB="0" distL="0" distR="0" wp14:anchorId="5FF06BFF" wp14:editId="256C10AC">
+          <wp:inline distT="0" distB="0" distL="0" distR="0" wp14:anchorId="3C3E3000" wp14:editId="71DDA194">
             <wp:extent cx="5400040" cy="1406525"/>
             <wp:effectExtent l="0" t="0" r="0" b="3175"/>
             <wp:docPr id="1023526946" name="Imagen 1"/>
@@ -4684,7 +4886,7 @@
           <w:lang w:eastAsia="es-EC"/>
         </w:rPr>
         <w:drawing>
-          <wp:inline distT="0" distB="0" distL="0" distR="0" wp14:anchorId="3DC853B4" wp14:editId="493FE33A">
+          <wp:inline distT="0" distB="0" distL="0" distR="0" wp14:anchorId="38745662" wp14:editId="18070567">
             <wp:extent cx="5400040" cy="979170"/>
             <wp:effectExtent l="0" t="0" r="0" b="0"/>
             <wp:docPr id="462659024" name="Imagen 1"/>
@@ -4748,7 +4950,7 @@
           <w:lang w:eastAsia="es-EC"/>
         </w:rPr>
         <w:drawing>
-          <wp:inline distT="0" distB="0" distL="0" distR="0" wp14:anchorId="32FD02CF" wp14:editId="2F6197C4">
+          <wp:inline distT="0" distB="0" distL="0" distR="0" wp14:anchorId="12C9C48E" wp14:editId="0D629118">
             <wp:extent cx="5400040" cy="1165860"/>
             <wp:effectExtent l="0" t="0" r="0" b="0"/>
             <wp:docPr id="1771412134" name="Imagen 1"/>
@@ -4806,7 +5008,14 @@
           <w:rFonts w:ascii="Arial" w:hAnsi="Arial" w:cs="Arial"/>
           <w:lang w:eastAsia="es-EC"/>
         </w:rPr>
-        <w:t>Creación de la rama máster y la subimos al GitHub</w:t>
+        <w:t>Creación de la rama máster</w:t>
+      </w:r>
+      <w:r>
+        <w:rPr>
+          <w:rFonts w:ascii="Arial" w:hAnsi="Arial" w:cs="Arial"/>
+          <w:lang w:eastAsia="es-EC"/>
+        </w:rPr>
+        <w:t xml:space="preserve"> y la subimos al GitHub</w:t>
       </w:r>
     </w:p>
     <w:p>
@@ -4851,7 +5060,7 @@
           <w:lang w:eastAsia="es-EC"/>
         </w:rPr>
         <w:drawing>
-          <wp:inline distT="0" distB="0" distL="0" distR="0" wp14:anchorId="4E080881" wp14:editId="253B0F96">
+          <wp:inline distT="0" distB="0" distL="0" distR="0" wp14:anchorId="114AA89B" wp14:editId="5F1BBED8">
             <wp:extent cx="5400040" cy="1650365"/>
             <wp:effectExtent l="0" t="0" r="0" b="6985"/>
             <wp:docPr id="1966840489" name="Imagen 1"/>
@@ -4937,7 +5146,7 @@
         </w:rPr>
         <w:lastRenderedPageBreak/>
         <w:drawing>
-          <wp:inline distT="0" distB="0" distL="0" distR="0" wp14:anchorId="65D1B559" wp14:editId="3926F897">
+          <wp:inline distT="0" distB="0" distL="0" distR="0" wp14:anchorId="0EA8581A" wp14:editId="1EFB4EC5">
             <wp:extent cx="5400040" cy="2214880"/>
             <wp:effectExtent l="0" t="0" r="0" b="0"/>
             <wp:docPr id="594839708" name="Imagen 1"/>
@@ -5040,7 +5249,7 @@
           <w:lang w:eastAsia="es-EC"/>
         </w:rPr>
         <w:drawing>
-          <wp:inline distT="0" distB="0" distL="0" distR="0" wp14:anchorId="271B89DB" wp14:editId="66845798">
+          <wp:inline distT="0" distB="0" distL="0" distR="0" wp14:anchorId="7C3AC0E1" wp14:editId="0E4702FD">
             <wp:extent cx="5400040" cy="1623695"/>
             <wp:effectExtent l="0" t="0" r="0" b="0"/>
             <wp:docPr id="998869698" name="Imagen 1"/>
@@ -5150,7 +5359,7 @@
           <w:lang w:eastAsia="es-EC"/>
         </w:rPr>
         <w:drawing>
-          <wp:inline distT="0" distB="0" distL="0" distR="0" wp14:anchorId="7E215588" wp14:editId="5FDB3126">
+          <wp:inline distT="0" distB="0" distL="0" distR="0" wp14:anchorId="304028D7" wp14:editId="00DC3F11">
             <wp:extent cx="5403731" cy="3204000"/>
             <wp:effectExtent l="0" t="0" r="6985" b="0"/>
             <wp:docPr id="375852686" name="Imagen 1"/>
@@ -5219,6 +5428,62 @@
         </w:rPr>
         <w:t>Implementación de GitFlow en GitHub.</w:t>
       </w:r>
+      <w:sdt>
+        <w:sdtPr>
+          <w:rPr>
+            <w:rFonts w:ascii="Arial" w:hAnsi="Arial" w:cs="Arial"/>
+            <w:lang w:eastAsia="es-EC"/>
+          </w:rPr>
+          <w:id w:val="1304892143"/>
+          <w:citation/>
+        </w:sdtPr>
+        <w:sdtContent>
+          <w:r>
+            <w:rPr>
+              <w:rFonts w:ascii="Arial" w:hAnsi="Arial" w:cs="Arial"/>
+              <w:lang w:eastAsia="es-EC"/>
+            </w:rPr>
+            <w:fldChar w:fldCharType="begin"/>
+          </w:r>
+          <w:r>
+            <w:rPr>
+              <w:rFonts w:ascii="Arial" w:hAnsi="Arial" w:cs="Arial"/>
+              <w:lang w:eastAsia="es-EC"/>
+            </w:rPr>
+            <w:instrText xml:space="preserve"> CITATION Git \l 12298 </w:instrText>
+          </w:r>
+          <w:r>
+            <w:rPr>
+              <w:rFonts w:ascii="Arial" w:hAnsi="Arial" w:cs="Arial"/>
+              <w:lang w:eastAsia="es-EC"/>
+            </w:rPr>
+            <w:fldChar w:fldCharType="separate"/>
+          </w:r>
+          <w:r>
+            <w:rPr>
+              <w:rFonts w:ascii="Arial" w:hAnsi="Arial" w:cs="Arial"/>
+              <w:noProof/>
+              <w:lang w:eastAsia="es-EC"/>
+            </w:rPr>
+            <w:t xml:space="preserve"> </w:t>
+          </w:r>
+          <w:r>
+            <w:rPr>
+              <w:rFonts w:ascii="Arial" w:hAnsi="Arial" w:cs="Arial"/>
+              <w:noProof/>
+              <w:lang w:eastAsia="es-EC"/>
+            </w:rPr>
+            <w:t>[2]</w:t>
+          </w:r>
+          <w:r>
+            <w:rPr>
+              <w:rFonts w:ascii="Arial" w:hAnsi="Arial" w:cs="Arial"/>
+              <w:lang w:eastAsia="es-EC"/>
+            </w:rPr>
+            <w:fldChar w:fldCharType="end"/>
+          </w:r>
+        </w:sdtContent>
+      </w:sdt>
     </w:p>
     <w:p>
       <w:pPr>
@@ -5347,6 +5612,74 @@
         </w:rPr>
         <w:t>Crear un diagrama de casos de uso para entender las interacciones del personal con la plataforma.</w:t>
       </w:r>
+      <w:sdt>
+        <w:sdtPr>
+          <w:rPr>
+            <w:rFonts w:ascii="Arial" w:hAnsi="Arial" w:cs="Arial"/>
+            <w:b/>
+            <w:bCs/>
+            <w:lang w:eastAsia="es-EC"/>
+          </w:rPr>
+          <w:id w:val="-1481151072"/>
+          <w:citation/>
+        </w:sdtPr>
+        <w:sdtContent>
+          <w:r>
+            <w:rPr>
+              <w:rFonts w:ascii="Arial" w:hAnsi="Arial" w:cs="Arial"/>
+              <w:b/>
+              <w:bCs/>
+              <w:lang w:eastAsia="es-EC"/>
+            </w:rPr>
+            <w:fldChar w:fldCharType="begin"/>
+          </w:r>
+          <w:r>
+            <w:rPr>
+              <w:rFonts w:ascii="Arial" w:hAnsi="Arial" w:cs="Arial"/>
+              <w:b/>
+              <w:bCs/>
+              <w:lang w:eastAsia="es-EC"/>
+            </w:rPr>
+            <w:instrText xml:space="preserve"> CITATION dib \l 12298 </w:instrText>
+          </w:r>
+          <w:r>
+            <w:rPr>
+              <w:rFonts w:ascii="Arial" w:hAnsi="Arial" w:cs="Arial"/>
+              <w:b/>
+              <w:bCs/>
+              <w:lang w:eastAsia="es-EC"/>
+            </w:rPr>
+            <w:fldChar w:fldCharType="separate"/>
+          </w:r>
+          <w:r>
+            <w:rPr>
+              <w:rFonts w:ascii="Arial" w:hAnsi="Arial" w:cs="Arial"/>
+              <w:b/>
+              <w:bCs/>
+              <w:noProof/>
+              <w:lang w:eastAsia="es-EC"/>
+            </w:rPr>
+            <w:t xml:space="preserve"> </w:t>
+          </w:r>
+          <w:r>
+            <w:rPr>
+              <w:rFonts w:ascii="Arial" w:hAnsi="Arial" w:cs="Arial"/>
+              <w:noProof/>
+              <w:lang w:eastAsia="es-EC"/>
+            </w:rPr>
+            <w:t>[3]</w:t>
+          </w:r>
+          <w:r>
+            <w:rPr>
+              <w:rFonts w:ascii="Arial" w:hAnsi="Arial" w:cs="Arial"/>
+              <w:b/>
+              <w:bCs/>
+              <w:lang w:eastAsia="es-EC"/>
+            </w:rPr>
+            <w:fldChar w:fldCharType="end"/>
+          </w:r>
+        </w:sdtContent>
+      </w:sdt>
     </w:p>
     <w:p>
       <w:pPr>
@@ -5390,7 +5723,7 @@
           <w:lang w:eastAsia="es-EC"/>
         </w:rPr>
         <w:drawing>
-          <wp:inline distT="0" distB="0" distL="0" distR="0" wp14:anchorId="76F96AA0" wp14:editId="597C6493">
+          <wp:inline distT="0" distB="0" distL="0" distR="0" wp14:anchorId="260D42F6" wp14:editId="7955B68F">
             <wp:extent cx="4250426" cy="5328000"/>
             <wp:effectExtent l="0" t="0" r="0" b="6350"/>
             <wp:docPr id="816581380" name="Imagen 1"/>
@@ -5656,6 +5989,74 @@
         <w:lastRenderedPageBreak/>
         <w:t>Realizar un diagrama de clases UML donde se evidencien los objetos y su relación bajo principios SOLID.</w:t>
       </w:r>
+      <w:sdt>
+        <w:sdtPr>
+          <w:rPr>
+            <w:rFonts w:ascii="Arial" w:hAnsi="Arial" w:cs="Arial"/>
+            <w:b/>
+            <w:bCs/>
+            <w:lang w:eastAsia="es-EC"/>
+          </w:rPr>
+          <w:id w:val="1908415219"/>
+          <w:citation/>
+        </w:sdtPr>
+        <w:sdtContent>
+          <w:r>
+            <w:rPr>
+              <w:rFonts w:ascii="Arial" w:hAnsi="Arial" w:cs="Arial"/>
+              <w:b/>
+              <w:bCs/>
+              <w:lang w:eastAsia="es-EC"/>
+            </w:rPr>
+            <w:fldChar w:fldCharType="begin"/>
+          </w:r>
+          <w:r>
+            <w:rPr>
+              <w:rFonts w:ascii="Arial" w:hAnsi="Arial" w:cs="Arial"/>
+              <w:b/>
+              <w:bCs/>
+              <w:lang w:eastAsia="es-EC"/>
+            </w:rPr>
+            <w:instrText xml:space="preserve"> CITATION dib \l 12298 </w:instrText>
+          </w:r>
+          <w:r>
+            <w:rPr>
+              <w:rFonts w:ascii="Arial" w:hAnsi="Arial" w:cs="Arial"/>
+              <w:b/>
+              <w:bCs/>
+              <w:lang w:eastAsia="es-EC"/>
+            </w:rPr>
+            <w:fldChar w:fldCharType="separate"/>
+          </w:r>
+          <w:r>
+            <w:rPr>
+              <w:rFonts w:ascii="Arial" w:hAnsi="Arial" w:cs="Arial"/>
+              <w:b/>
+              <w:bCs/>
+              <w:noProof/>
+              <w:lang w:eastAsia="es-EC"/>
+            </w:rPr>
+            <w:t xml:space="preserve"> </w:t>
+          </w:r>
+          <w:r>
+            <w:rPr>
+              <w:rFonts w:ascii="Arial" w:hAnsi="Arial" w:cs="Arial"/>
+              <w:noProof/>
+              <w:lang w:eastAsia="es-EC"/>
+            </w:rPr>
+            <w:t>[3]</w:t>
+          </w:r>
+          <w:r>
+            <w:rPr>
+              <w:rFonts w:ascii="Arial" w:hAnsi="Arial" w:cs="Arial"/>
+              <w:b/>
+              <w:bCs/>
+              <w:lang w:eastAsia="es-EC"/>
+            </w:rPr>
+            <w:fldChar w:fldCharType="end"/>
+          </w:r>
+        </w:sdtContent>
+      </w:sdt>
     </w:p>
     <w:p>
       <w:pPr>
@@ -5685,7 +6086,7 @@
           <w:lang w:eastAsia="es-EC"/>
         </w:rPr>
         <w:drawing>
-          <wp:inline distT="0" distB="0" distL="0" distR="0" wp14:anchorId="142B3D56" wp14:editId="59DCCF3A">
+          <wp:inline distT="0" distB="0" distL="0" distR="0" wp14:anchorId="031BC6AE" wp14:editId="53185DF9">
             <wp:extent cx="5601263" cy="2304000"/>
             <wp:effectExtent l="0" t="0" r="0" b="1270"/>
             <wp:docPr id="2070492238" name="Imagen 1"/>
@@ -5957,6 +6358,74 @@
         </w:rPr>
         <w:t>Diseñar la arquitectura general del sistema integrando el flujo de versiones.</w:t>
       </w:r>
+      <w:sdt>
+        <w:sdtPr>
+          <w:rPr>
+            <w:rFonts w:ascii="Arial" w:hAnsi="Arial" w:cs="Arial"/>
+            <w:b/>
+            <w:bCs/>
+            <w:lang w:eastAsia="es-EC"/>
+          </w:rPr>
+          <w:id w:val="827713730"/>
+          <w:citation/>
+        </w:sdtPr>
+        <w:sdtContent>
+          <w:r>
+            <w:rPr>
+              <w:rFonts w:ascii="Arial" w:hAnsi="Arial" w:cs="Arial"/>
+              <w:b/>
+              <w:bCs/>
+              <w:lang w:eastAsia="es-EC"/>
+            </w:rPr>
+            <w:fldChar w:fldCharType="begin"/>
+          </w:r>
+          <w:r>
+            <w:rPr>
+              <w:rFonts w:ascii="Arial" w:hAnsi="Arial" w:cs="Arial"/>
+              <w:b/>
+              <w:bCs/>
+              <w:lang w:eastAsia="es-EC"/>
+            </w:rPr>
+            <w:instrText xml:space="preserve"> CITATION dib \l 12298 </w:instrText>
+          </w:r>
+          <w:r>
+            <w:rPr>
+              <w:rFonts w:ascii="Arial" w:hAnsi="Arial" w:cs="Arial"/>
+              <w:b/>
+              <w:bCs/>
+              <w:lang w:eastAsia="es-EC"/>
+            </w:rPr>
+            <w:fldChar w:fldCharType="separate"/>
+          </w:r>
+          <w:r>
+            <w:rPr>
+              <w:rFonts w:ascii="Arial" w:hAnsi="Arial" w:cs="Arial"/>
+              <w:b/>
+              <w:bCs/>
+              <w:noProof/>
+              <w:lang w:eastAsia="es-EC"/>
+            </w:rPr>
+            <w:t xml:space="preserve"> </w:t>
+          </w:r>
+          <w:r>
+            <w:rPr>
+              <w:rFonts w:ascii="Arial" w:hAnsi="Arial" w:cs="Arial"/>
+              <w:noProof/>
+              <w:lang w:eastAsia="es-EC"/>
+            </w:rPr>
+            <w:t>[3]</w:t>
+          </w:r>
+          <w:r>
+            <w:rPr>
+              <w:rFonts w:ascii="Arial" w:hAnsi="Arial" w:cs="Arial"/>
+              <w:b/>
+              <w:bCs/>
+              <w:lang w:eastAsia="es-EC"/>
+            </w:rPr>
+            <w:fldChar w:fldCharType="end"/>
+          </w:r>
+        </w:sdtContent>
+      </w:sdt>
     </w:p>
     <w:p>
       <w:pPr>
@@ -5982,7 +6451,7 @@
           <w:lang w:eastAsia="es-EC"/>
         </w:rPr>
         <w:drawing>
-          <wp:inline distT="0" distB="0" distL="0" distR="0" wp14:anchorId="0706CCC0" wp14:editId="2AE98BB6">
+          <wp:inline distT="0" distB="0" distL="0" distR="0" wp14:anchorId="2E0F3635" wp14:editId="11199951">
             <wp:extent cx="5115190" cy="2880000"/>
             <wp:effectExtent l="0" t="0" r="0" b="0"/>
             <wp:docPr id="1328175242" name="Imagen 1"/>
@@ -6354,7 +6823,7 @@
           <w:lang w:eastAsia="es-EC"/>
         </w:rPr>
         <w:drawing>
-          <wp:inline distT="0" distB="0" distL="0" distR="0" wp14:anchorId="5CA1942A" wp14:editId="3DBE014D">
+          <wp:inline distT="0" distB="0" distL="0" distR="0" wp14:anchorId="455AFC66" wp14:editId="35F6CD9B">
             <wp:extent cx="4081977" cy="2048510"/>
             <wp:effectExtent l="0" t="0" r="0" b="8890"/>
             <wp:docPr id="115947552" name="Imagen 1"/>
@@ -6609,7 +7078,7 @@
         </w:rPr>
         <w:lastRenderedPageBreak/>
         <w:drawing>
-          <wp:inline distT="0" distB="0" distL="0" distR="0" wp14:anchorId="3D44ABFB" wp14:editId="0E86A131">
+          <wp:inline distT="0" distB="0" distL="0" distR="0" wp14:anchorId="1C5C0F23" wp14:editId="001D1E4A">
             <wp:extent cx="5303059" cy="1591310"/>
             <wp:effectExtent l="0" t="0" r="0" b="8890"/>
             <wp:docPr id="1978332826" name="Imagen 1"/>
@@ -6867,7 +7336,7 @@
           <w:lang w:eastAsia="es-EC"/>
         </w:rPr>
         <w:drawing>
-          <wp:inline distT="0" distB="0" distL="0" distR="0" wp14:anchorId="5DE28295" wp14:editId="55B8674B">
+          <wp:inline distT="0" distB="0" distL="0" distR="0" wp14:anchorId="0205C4F0" wp14:editId="13E42131">
             <wp:extent cx="4087090" cy="3920393"/>
             <wp:effectExtent l="0" t="0" r="8890" b="4445"/>
             <wp:docPr id="588678660" name="Imagen 1"/>
@@ -6988,30 +7457,20 @@
           <w:lang w:eastAsia="es-EC"/>
         </w:rPr>
       </w:pPr>
-    </w:p>
-    <w:p>
-      <w:pPr>
-        <w:widowControl w:val="0"/>
-        <w:pBdr>
-          <w:top w:val="nil"/>
-          <w:left w:val="nil"/>
-          <w:bottom w:val="nil"/>
-          <w:right w:val="nil"/>
-          <w:between w:val="nil"/>
-        </w:pBdr>
-        <w:spacing w:after="0" w:line="360" w:lineRule="auto"/>
-        <w:jc w:val="both"/>
-        <w:rPr>
-          <w:rFonts w:ascii="Arial" w:hAnsi="Arial" w:cs="Arial"/>
-          <w:lang w:eastAsia="es-EC"/>
-        </w:rPr>
-      </w:pPr>
-      <w:r>
-        <w:rPr>
-          <w:rFonts w:ascii="Arial" w:hAnsi="Arial" w:cs="Arial"/>
-          <w:lang w:eastAsia="es-EC"/>
-        </w:rPr>
-        <w:t xml:space="preserve">En el sistema de control de rescate y adopción animal se aplica el patrón de diseño Factory Method para facilitar la creación de diferentes tipos de animales rescatados. Para ello, se utiliza la clase abstracta </w:t>
+      <w:r>
+        <w:rPr>
+          <w:rFonts w:ascii="Arial" w:hAnsi="Arial" w:cs="Arial"/>
+          <w:lang w:eastAsia="es-EC"/>
+        </w:rPr>
+        <w:t xml:space="preserve">En el sistema de control de rescate y adopción animal se aplica el patrón de diseño Factory </w:t>
+      </w:r>
+      <w:r>
+        <w:rPr>
+          <w:rFonts w:ascii="Arial" w:hAnsi="Arial" w:cs="Arial"/>
+          <w:lang w:eastAsia="es-EC"/>
+        </w:rPr>
+        <w:lastRenderedPageBreak/>
+        <w:t xml:space="preserve">Method para facilitar la creación de diferentes tipos de animales rescatados. Para ello, se utiliza la clase abstracta </w:t>
       </w:r>
       <w:proofErr w:type="spellStart"/>
       <w:r>
@@ -7101,35 +7560,36 @@
         <w:jc w:val="both"/>
         <w:rPr>
           <w:rFonts w:ascii="Arial" w:hAnsi="Arial" w:cs="Arial"/>
-          <w:i/>
-          <w:iCs/>
-          <w:lang w:eastAsia="es-EC"/>
-        </w:rPr>
-      </w:pPr>
-    </w:p>
-    <w:p>
-      <w:pPr>
-        <w:widowControl w:val="0"/>
-        <w:pBdr>
-          <w:top w:val="nil"/>
-          <w:left w:val="nil"/>
-          <w:bottom w:val="nil"/>
-          <w:right w:val="nil"/>
-          <w:between w:val="nil"/>
-        </w:pBdr>
-        <w:spacing w:after="0" w:line="360" w:lineRule="auto"/>
-        <w:jc w:val="both"/>
-        <w:rPr>
-          <w:rFonts w:ascii="Arial" w:hAnsi="Arial" w:cs="Arial"/>
-          <w:i/>
-          <w:iCs/>
-          <w:lang w:eastAsia="es-EC"/>
-        </w:rPr>
-      </w:pPr>
-    </w:p>
-    <w:p>
-      <w:pPr>
-        <w:widowControl w:val="0"/>
+          <w:lang w:eastAsia="es-EC"/>
+        </w:rPr>
+      </w:pPr>
+    </w:p>
+    <w:p>
+      <w:pPr>
+        <w:widowControl w:val="0"/>
+        <w:pBdr>
+          <w:top w:val="nil"/>
+          <w:left w:val="nil"/>
+          <w:bottom w:val="nil"/>
+          <w:right w:val="nil"/>
+          <w:between w:val="nil"/>
+        </w:pBdr>
+        <w:spacing w:after="0" w:line="360" w:lineRule="auto"/>
+        <w:jc w:val="both"/>
+        <w:rPr>
+          <w:rFonts w:ascii="Arial" w:hAnsi="Arial" w:cs="Arial"/>
+          <w:lang w:eastAsia="es-EC"/>
+        </w:rPr>
+      </w:pPr>
+    </w:p>
+    <w:p>
+      <w:pPr>
+        <w:pStyle w:val="Prrafodelista"/>
+        <w:widowControl w:val="0"/>
+        <w:numPr>
+          <w:ilvl w:val="0"/>
+          <w:numId w:val="27"/>
+        </w:numPr>
         <w:pBdr>
           <w:top w:val="nil"/>
           <w:left w:val="nil"/>
@@ -7153,338 +7613,16 @@
           <w:bCs/>
           <w:lang w:eastAsia="es-EC"/>
         </w:rPr>
-        <w:t>Diagrama de secuencia del proceso de rescate animal</w:t>
-      </w:r>
-    </w:p>
-    <w:p>
-      <w:pPr>
-        <w:widowControl w:val="0"/>
-        <w:pBdr>
-          <w:top w:val="nil"/>
-          <w:left w:val="nil"/>
-          <w:bottom w:val="nil"/>
-          <w:right w:val="nil"/>
-          <w:between w:val="nil"/>
-        </w:pBdr>
-        <w:spacing w:after="0" w:line="360" w:lineRule="auto"/>
-        <w:jc w:val="both"/>
-        <w:rPr>
-          <w:rFonts w:ascii="Arial" w:hAnsi="Arial" w:cs="Arial"/>
-          <w:lang w:eastAsia="es-EC"/>
-        </w:rPr>
-      </w:pPr>
-    </w:p>
-    <w:p>
-      <w:pPr>
-        <w:widowControl w:val="0"/>
-        <w:pBdr>
-          <w:top w:val="nil"/>
-          <w:left w:val="nil"/>
-          <w:bottom w:val="nil"/>
-          <w:right w:val="nil"/>
-          <w:between w:val="nil"/>
-        </w:pBdr>
-        <w:spacing w:after="0" w:line="360" w:lineRule="auto"/>
-        <w:jc w:val="both"/>
-        <w:rPr>
-          <w:rFonts w:ascii="Arial" w:hAnsi="Arial" w:cs="Arial"/>
-          <w:i/>
-          <w:iCs/>
-          <w:lang w:eastAsia="es-EC"/>
-        </w:rPr>
-      </w:pPr>
-    </w:p>
-    <w:p>
-      <w:pPr>
-        <w:pStyle w:val="Prrafodelista"/>
-        <w:widowControl w:val="0"/>
-        <w:numPr>
-          <w:ilvl w:val="0"/>
-          <w:numId w:val="22"/>
-        </w:numPr>
-        <w:pBdr>
-          <w:top w:val="nil"/>
-          <w:left w:val="nil"/>
-          <w:bottom w:val="nil"/>
-          <w:right w:val="nil"/>
-          <w:between w:val="nil"/>
-        </w:pBdr>
-        <w:spacing w:after="0" w:line="360" w:lineRule="auto"/>
-        <w:jc w:val="both"/>
+        <w:t xml:space="preserve">Diagrama de </w:t>
+      </w:r>
+      <w:r>
         <w:rPr>
           <w:rFonts w:ascii="Arial" w:hAnsi="Arial" w:cs="Arial"/>
           <w:b/>
           <w:bCs/>
           <w:lang w:eastAsia="es-EC"/>
         </w:rPr>
-      </w:pPr>
-      <w:r>
-        <w:rPr>
-          <w:rFonts w:ascii="Arial" w:hAnsi="Arial" w:cs="Arial"/>
-          <w:b/>
-          <w:bCs/>
-          <w:lang w:eastAsia="es-EC"/>
-        </w:rPr>
-        <w:t>Documentación del diseño</w:t>
-      </w:r>
-    </w:p>
-    <w:p>
-      <w:pPr>
-        <w:pStyle w:val="Prrafodelista"/>
-        <w:widowControl w:val="0"/>
-        <w:numPr>
-          <w:ilvl w:val="0"/>
-          <w:numId w:val="26"/>
-        </w:numPr>
-        <w:pBdr>
-          <w:top w:val="nil"/>
-          <w:left w:val="nil"/>
-          <w:bottom w:val="nil"/>
-          <w:right w:val="nil"/>
-          <w:between w:val="nil"/>
-        </w:pBdr>
-        <w:spacing w:after="0" w:line="360" w:lineRule="auto"/>
-        <w:jc w:val="both"/>
-        <w:rPr>
-          <w:rFonts w:ascii="Arial" w:hAnsi="Arial" w:cs="Arial"/>
-          <w:b/>
-          <w:bCs/>
-          <w:lang w:eastAsia="es-EC"/>
-        </w:rPr>
-      </w:pPr>
-      <w:r>
-        <w:rPr>
-          <w:rFonts w:ascii="Arial" w:hAnsi="Arial" w:cs="Arial"/>
-          <w:b/>
-          <w:bCs/>
-          <w:lang w:eastAsia="es-EC"/>
-        </w:rPr>
-        <w:t xml:space="preserve">Justificar el uso de Gitflow: Incluir el enlace al repositorio de GitHub y capturas de pantalla del historial de ramas/commits que evidencien el flujo de trabajo. </w:t>
-      </w:r>
-    </w:p>
-    <w:p>
-      <w:pPr>
-        <w:widowControl w:val="0"/>
-        <w:pBdr>
-          <w:top w:val="nil"/>
-          <w:left w:val="nil"/>
-          <w:bottom w:val="nil"/>
-          <w:right w:val="nil"/>
-          <w:between w:val="nil"/>
-        </w:pBdr>
-        <w:spacing w:after="0" w:line="360" w:lineRule="auto"/>
-        <w:ind w:left="360"/>
-        <w:jc w:val="both"/>
-        <w:rPr>
-          <w:rFonts w:ascii="Arial" w:hAnsi="Arial" w:cs="Arial"/>
-          <w:lang w:eastAsia="es-EC"/>
-        </w:rPr>
-      </w:pPr>
-    </w:p>
-    <w:p>
-      <w:pPr>
-        <w:widowControl w:val="0"/>
-        <w:pBdr>
-          <w:top w:val="nil"/>
-          <w:left w:val="nil"/>
-          <w:bottom w:val="nil"/>
-          <w:right w:val="nil"/>
-          <w:between w:val="nil"/>
-        </w:pBdr>
-        <w:spacing w:after="0" w:line="360" w:lineRule="auto"/>
-        <w:ind w:left="360"/>
-        <w:jc w:val="both"/>
-        <w:rPr>
-          <w:rFonts w:ascii="Arial" w:hAnsi="Arial" w:cs="Arial"/>
-          <w:lang w:eastAsia="es-EC"/>
-        </w:rPr>
-      </w:pPr>
-      <w:r>
-        <w:rPr>
-          <w:rFonts w:ascii="Arial" w:hAnsi="Arial" w:cs="Arial"/>
-          <w:lang w:eastAsia="es-EC"/>
-        </w:rPr>
-        <w:t xml:space="preserve">Para organizar el desarrollo del sistema de control de rescate y adopción animal, se utilizó Git y GitHub como herramientas de control de versiones. Se trabajó con una estructura basada en GitFlow, utilizando la rama </w:t>
-      </w:r>
-      <w:proofErr w:type="gramStart"/>
-      <w:r>
-        <w:rPr>
-          <w:rFonts w:ascii="Arial" w:hAnsi="Arial" w:cs="Arial"/>
-          <w:lang w:eastAsia="es-EC"/>
-        </w:rPr>
-        <w:t>master</w:t>
-      </w:r>
-      <w:proofErr w:type="gramEnd"/>
-      <w:r>
-        <w:rPr>
-          <w:rFonts w:ascii="Arial" w:hAnsi="Arial" w:cs="Arial"/>
-          <w:lang w:eastAsia="es-EC"/>
-        </w:rPr>
-        <w:t xml:space="preserve"> para mantener la versión principal del proyecto, develop para integrar los avances y feature/</w:t>
-      </w:r>
-      <w:proofErr w:type="spellStart"/>
-      <w:r>
-        <w:rPr>
-          <w:rFonts w:ascii="Arial" w:hAnsi="Arial" w:cs="Arial"/>
-          <w:lang w:eastAsia="es-EC"/>
-        </w:rPr>
-        <w:t>analisis</w:t>
-      </w:r>
-      <w:proofErr w:type="spellEnd"/>
-      <w:r>
-        <w:rPr>
-          <w:rFonts w:ascii="Arial" w:hAnsi="Arial" w:cs="Arial"/>
-          <w:lang w:eastAsia="es-EC"/>
-        </w:rPr>
-        <w:t>-requisitos para organizar el trabajo relacionado con el análisis de requisitos. Esta organización permite mantener un historial de los cambios realizados y facilita el seguimiento del desarrollo del sistema.</w:t>
-      </w:r>
-    </w:p>
-    <w:p>
-      <w:pPr>
-        <w:pStyle w:val="Prrafodelista"/>
-        <w:widowControl w:val="0"/>
-        <w:pBdr>
-          <w:top w:val="nil"/>
-          <w:left w:val="nil"/>
-          <w:bottom w:val="nil"/>
-          <w:right w:val="nil"/>
-          <w:between w:val="nil"/>
-        </w:pBdr>
-        <w:spacing w:after="0" w:line="360" w:lineRule="auto"/>
-        <w:jc w:val="both"/>
-        <w:rPr>
-          <w:rFonts w:ascii="Arial" w:hAnsi="Arial" w:cs="Arial"/>
-          <w:lang w:eastAsia="es-EC"/>
-        </w:rPr>
-      </w:pPr>
-    </w:p>
-    <w:p>
-      <w:pPr>
-        <w:pStyle w:val="Prrafodelista"/>
-        <w:widowControl w:val="0"/>
-        <w:pBdr>
-          <w:top w:val="nil"/>
-          <w:left w:val="nil"/>
-          <w:bottom w:val="nil"/>
-          <w:right w:val="nil"/>
-          <w:between w:val="nil"/>
-        </w:pBdr>
-        <w:spacing w:after="0" w:line="360" w:lineRule="auto"/>
-        <w:jc w:val="both"/>
-        <w:rPr>
-          <w:rFonts w:ascii="Arial" w:hAnsi="Arial" w:cs="Arial"/>
-          <w:lang w:eastAsia="es-EC"/>
-        </w:rPr>
-      </w:pPr>
-    </w:p>
-    <w:p>
-      <w:pPr>
-        <w:pStyle w:val="Prrafodelista"/>
-        <w:widowControl w:val="0"/>
-        <w:pBdr>
-          <w:top w:val="nil"/>
-          <w:left w:val="nil"/>
-          <w:bottom w:val="nil"/>
-          <w:right w:val="nil"/>
-          <w:between w:val="nil"/>
-        </w:pBdr>
-        <w:spacing w:after="0" w:line="360" w:lineRule="auto"/>
-        <w:jc w:val="both"/>
-        <w:rPr>
-          <w:rFonts w:ascii="Arial" w:hAnsi="Arial" w:cs="Arial"/>
-          <w:lang w:eastAsia="es-EC"/>
-        </w:rPr>
-      </w:pPr>
-    </w:p>
-    <w:p>
-      <w:pPr>
-        <w:pStyle w:val="Prrafodelista"/>
-        <w:widowControl w:val="0"/>
-        <w:pBdr>
-          <w:top w:val="nil"/>
-          <w:left w:val="nil"/>
-          <w:bottom w:val="nil"/>
-          <w:right w:val="nil"/>
-          <w:between w:val="nil"/>
-        </w:pBdr>
-        <w:spacing w:after="0" w:line="360" w:lineRule="auto"/>
-        <w:jc w:val="both"/>
-        <w:rPr>
-          <w:rFonts w:ascii="Arial" w:hAnsi="Arial" w:cs="Arial"/>
-          <w:lang w:eastAsia="es-EC"/>
-        </w:rPr>
-      </w:pPr>
-    </w:p>
-    <w:p>
-      <w:pPr>
-        <w:pStyle w:val="Prrafodelista"/>
-        <w:widowControl w:val="0"/>
-        <w:pBdr>
-          <w:top w:val="nil"/>
-          <w:left w:val="nil"/>
-          <w:bottom w:val="nil"/>
-          <w:right w:val="nil"/>
-          <w:between w:val="nil"/>
-        </w:pBdr>
-        <w:spacing w:after="0" w:line="360" w:lineRule="auto"/>
-        <w:jc w:val="both"/>
-        <w:rPr>
-          <w:rFonts w:ascii="Arial" w:hAnsi="Arial" w:cs="Arial"/>
-          <w:lang w:eastAsia="es-EC"/>
-        </w:rPr>
-      </w:pPr>
-    </w:p>
-    <w:p>
-      <w:pPr>
-        <w:pStyle w:val="Prrafodelista"/>
-        <w:widowControl w:val="0"/>
-        <w:pBdr>
-          <w:top w:val="nil"/>
-          <w:left w:val="nil"/>
-          <w:bottom w:val="nil"/>
-          <w:right w:val="nil"/>
-          <w:between w:val="nil"/>
-        </w:pBdr>
-        <w:spacing w:after="0" w:line="360" w:lineRule="auto"/>
-        <w:jc w:val="both"/>
-        <w:rPr>
-          <w:rFonts w:ascii="Arial" w:hAnsi="Arial" w:cs="Arial"/>
-          <w:lang w:eastAsia="es-EC"/>
-        </w:rPr>
-      </w:pPr>
-    </w:p>
-    <w:p>
-      <w:pPr>
-        <w:pStyle w:val="Prrafodelista"/>
-        <w:widowControl w:val="0"/>
-        <w:numPr>
-          <w:ilvl w:val="0"/>
-          <w:numId w:val="26"/>
-        </w:numPr>
-        <w:pBdr>
-          <w:top w:val="nil"/>
-          <w:left w:val="nil"/>
-          <w:bottom w:val="nil"/>
-          <w:right w:val="nil"/>
-          <w:between w:val="nil"/>
-        </w:pBdr>
-        <w:spacing w:after="0" w:line="360" w:lineRule="auto"/>
-        <w:jc w:val="both"/>
-        <w:rPr>
-          <w:rFonts w:ascii="Arial" w:hAnsi="Arial" w:cs="Arial"/>
-          <w:b/>
-          <w:bCs/>
-          <w:lang w:eastAsia="es-EC"/>
-        </w:rPr>
-      </w:pPr>
-      <w:r>
-        <w:rPr>
-          <w:rFonts w:ascii="Arial" w:hAnsi="Arial" w:cs="Arial"/>
-          <w:b/>
-          <w:bCs/>
-          <w:lang w:eastAsia="es-EC"/>
-        </w:rPr>
-        <w:t>Incluir diagramas de clases y secuencia donde se refleje la implementación de los patrones.</w:t>
+        <w:t>secuencia donde se refleje la implementación de los patrones.</w:t>
       </w:r>
     </w:p>
     <w:p>
@@ -7509,9 +7647,8 @@
           <w:noProof/>
           <w:lang w:eastAsia="es-EC"/>
         </w:rPr>
-        <w:lastRenderedPageBreak/>
         <w:drawing>
-          <wp:inline distT="0" distB="0" distL="0" distR="0" wp14:anchorId="1E5F87EF" wp14:editId="51EE8D93">
+          <wp:inline distT="0" distB="0" distL="0" distR="0" wp14:anchorId="78B41BFB" wp14:editId="30A255D5">
             <wp:extent cx="5400040" cy="2258695"/>
             <wp:effectExtent l="0" t="0" r="0" b="8255"/>
             <wp:docPr id="936033947" name="Imagen 1"/>
@@ -7672,6 +7809,953 @@
     </w:p>
     <w:p>
       <w:pPr>
+        <w:widowControl w:val="0"/>
+        <w:pBdr>
+          <w:top w:val="nil"/>
+          <w:left w:val="nil"/>
+          <w:bottom w:val="nil"/>
+          <w:right w:val="nil"/>
+          <w:between w:val="nil"/>
+        </w:pBdr>
+        <w:spacing w:after="0" w:line="360" w:lineRule="auto"/>
+        <w:jc w:val="both"/>
+        <w:rPr>
+          <w:rFonts w:ascii="Arial" w:hAnsi="Arial" w:cs="Arial"/>
+          <w:lang w:eastAsia="es-EC"/>
+        </w:rPr>
+      </w:pPr>
+    </w:p>
+    <w:p>
+      <w:pPr>
+        <w:widowControl w:val="0"/>
+        <w:pBdr>
+          <w:top w:val="nil"/>
+          <w:left w:val="nil"/>
+          <w:bottom w:val="nil"/>
+          <w:right w:val="nil"/>
+          <w:between w:val="nil"/>
+        </w:pBdr>
+        <w:spacing w:after="0" w:line="360" w:lineRule="auto"/>
+        <w:jc w:val="both"/>
+        <w:rPr>
+          <w:rFonts w:ascii="Arial" w:hAnsi="Arial" w:cs="Arial"/>
+          <w:i/>
+          <w:iCs/>
+          <w:lang w:eastAsia="es-EC"/>
+        </w:rPr>
+      </w:pPr>
+    </w:p>
+    <w:p>
+      <w:pPr>
+        <w:pStyle w:val="Prrafodelista"/>
+        <w:widowControl w:val="0"/>
+        <w:numPr>
+          <w:ilvl w:val="0"/>
+          <w:numId w:val="22"/>
+        </w:numPr>
+        <w:pBdr>
+          <w:top w:val="nil"/>
+          <w:left w:val="nil"/>
+          <w:bottom w:val="nil"/>
+          <w:right w:val="nil"/>
+          <w:between w:val="nil"/>
+        </w:pBdr>
+        <w:spacing w:after="0" w:line="360" w:lineRule="auto"/>
+        <w:jc w:val="both"/>
+        <w:rPr>
+          <w:rFonts w:ascii="Arial" w:hAnsi="Arial" w:cs="Arial"/>
+          <w:b/>
+          <w:bCs/>
+          <w:lang w:eastAsia="es-EC"/>
+        </w:rPr>
+      </w:pPr>
+      <w:r>
+        <w:rPr>
+          <w:rFonts w:ascii="Arial" w:hAnsi="Arial" w:cs="Arial"/>
+          <w:b/>
+          <w:bCs/>
+          <w:lang w:eastAsia="es-EC"/>
+        </w:rPr>
+        <w:t>Documentación del diseño</w:t>
+      </w:r>
+    </w:p>
+    <w:p>
+      <w:pPr>
+        <w:pStyle w:val="Prrafodelista"/>
+        <w:widowControl w:val="0"/>
+        <w:pBdr>
+          <w:top w:val="nil"/>
+          <w:left w:val="nil"/>
+          <w:bottom w:val="nil"/>
+          <w:right w:val="nil"/>
+          <w:between w:val="nil"/>
+        </w:pBdr>
+        <w:spacing w:after="0" w:line="360" w:lineRule="auto"/>
+        <w:jc w:val="both"/>
+        <w:rPr>
+          <w:rFonts w:ascii="Arial" w:hAnsi="Arial" w:cs="Arial"/>
+          <w:b/>
+          <w:bCs/>
+          <w:lang w:eastAsia="es-EC"/>
+        </w:rPr>
+      </w:pPr>
+    </w:p>
+    <w:p>
+      <w:pPr>
+        <w:pStyle w:val="Prrafodelista"/>
+        <w:widowControl w:val="0"/>
+        <w:numPr>
+          <w:ilvl w:val="0"/>
+          <w:numId w:val="27"/>
+        </w:numPr>
+        <w:pBdr>
+          <w:top w:val="nil"/>
+          <w:left w:val="nil"/>
+          <w:bottom w:val="nil"/>
+          <w:right w:val="nil"/>
+          <w:between w:val="nil"/>
+        </w:pBdr>
+        <w:spacing w:after="0" w:line="360" w:lineRule="auto"/>
+        <w:jc w:val="both"/>
+        <w:rPr>
+          <w:rFonts w:ascii="Arial" w:hAnsi="Arial" w:cs="Arial"/>
+          <w:b/>
+          <w:bCs/>
+          <w:lang w:eastAsia="es-EC"/>
+        </w:rPr>
+      </w:pPr>
+      <w:r>
+        <w:rPr>
+          <w:rFonts w:ascii="Arial" w:hAnsi="Arial" w:cs="Arial"/>
+          <w:b/>
+          <w:bCs/>
+          <w:lang w:eastAsia="es-EC"/>
+        </w:rPr>
+        <w:lastRenderedPageBreak/>
+        <w:t>Justificar el uso de Gitflow: Incluir el enlace al repositorio de GitHub y</w:t>
+      </w:r>
+      <w:r>
+        <w:rPr>
+          <w:rFonts w:ascii="Arial" w:hAnsi="Arial" w:cs="Arial"/>
+          <w:b/>
+          <w:bCs/>
+          <w:lang w:eastAsia="es-EC"/>
+        </w:rPr>
+        <w:t xml:space="preserve"> </w:t>
+      </w:r>
+      <w:r>
+        <w:rPr>
+          <w:rFonts w:ascii="Arial" w:hAnsi="Arial" w:cs="Arial"/>
+          <w:b/>
+          <w:bCs/>
+          <w:lang w:eastAsia="es-EC"/>
+        </w:rPr>
+        <w:t>capturas de pantalla del historial de ramas/commits que evidencien el flujo</w:t>
+      </w:r>
+      <w:r>
+        <w:rPr>
+          <w:rFonts w:ascii="Arial" w:hAnsi="Arial" w:cs="Arial"/>
+          <w:b/>
+          <w:bCs/>
+          <w:lang w:eastAsia="es-EC"/>
+        </w:rPr>
+        <w:t xml:space="preserve"> </w:t>
+      </w:r>
+      <w:r>
+        <w:rPr>
+          <w:rFonts w:ascii="Arial" w:hAnsi="Arial" w:cs="Arial"/>
+          <w:b/>
+          <w:bCs/>
+          <w:lang w:eastAsia="es-EC"/>
+        </w:rPr>
+        <w:t>de trabajo.</w:t>
+      </w:r>
+      <w:r>
+        <w:rPr>
+          <w:rFonts w:ascii="Arial" w:hAnsi="Arial" w:cs="Arial"/>
+          <w:b/>
+          <w:bCs/>
+          <w:lang w:eastAsia="es-EC"/>
+        </w:rPr>
+        <w:t xml:space="preserve"> </w:t>
+      </w:r>
+    </w:p>
+    <w:p>
+      <w:pPr>
+        <w:widowControl w:val="0"/>
+        <w:pBdr>
+          <w:top w:val="nil"/>
+          <w:left w:val="nil"/>
+          <w:bottom w:val="nil"/>
+          <w:right w:val="nil"/>
+          <w:between w:val="nil"/>
+        </w:pBdr>
+        <w:spacing w:after="0" w:line="360" w:lineRule="auto"/>
+        <w:ind w:left="360"/>
+        <w:jc w:val="both"/>
+        <w:rPr>
+          <w:rFonts w:ascii="Arial" w:hAnsi="Arial" w:cs="Arial"/>
+          <w:lang w:eastAsia="es-EC"/>
+        </w:rPr>
+      </w:pPr>
+    </w:p>
+    <w:p>
+      <w:pPr>
+        <w:widowControl w:val="0"/>
+        <w:pBdr>
+          <w:top w:val="nil"/>
+          <w:left w:val="nil"/>
+          <w:bottom w:val="nil"/>
+          <w:right w:val="nil"/>
+          <w:between w:val="nil"/>
+        </w:pBdr>
+        <w:spacing w:after="0" w:line="360" w:lineRule="auto"/>
+        <w:jc w:val="both"/>
+        <w:rPr>
+          <w:rFonts w:ascii="Arial" w:hAnsi="Arial" w:cs="Arial"/>
+          <w:lang w:eastAsia="es-EC"/>
+        </w:rPr>
+      </w:pPr>
+      <w:r>
+        <w:rPr>
+          <w:rFonts w:ascii="Arial" w:hAnsi="Arial" w:cs="Arial"/>
+          <w:lang w:eastAsia="es-EC"/>
+        </w:rPr>
+        <w:t xml:space="preserve">Para organizar el desarrollo </w:t>
+      </w:r>
+      <w:r>
+        <w:rPr>
+          <w:rFonts w:ascii="Arial" w:hAnsi="Arial" w:cs="Arial"/>
+          <w:lang w:eastAsia="es-EC"/>
+        </w:rPr>
+        <w:t>de la actividad 1</w:t>
+      </w:r>
+      <w:r>
+        <w:rPr>
+          <w:rFonts w:ascii="Arial" w:hAnsi="Arial" w:cs="Arial"/>
+          <w:lang w:eastAsia="es-EC"/>
+        </w:rPr>
+        <w:t xml:space="preserve">, se utilizó Git y GitHub como herramientas de control de versiones. Se trabajó con una estructura basada en GitFlow, utilizando la rama </w:t>
+      </w:r>
+      <w:proofErr w:type="gramStart"/>
+      <w:r>
+        <w:rPr>
+          <w:rFonts w:ascii="Arial" w:hAnsi="Arial" w:cs="Arial"/>
+          <w:lang w:eastAsia="es-EC"/>
+        </w:rPr>
+        <w:t>master</w:t>
+      </w:r>
+      <w:proofErr w:type="gramEnd"/>
+      <w:r>
+        <w:rPr>
+          <w:rFonts w:ascii="Arial" w:hAnsi="Arial" w:cs="Arial"/>
+          <w:lang w:eastAsia="es-EC"/>
+        </w:rPr>
+        <w:t xml:space="preserve"> para mantener la versión principal del proyecto, develop para integrar los avances y feature/</w:t>
+      </w:r>
+      <w:proofErr w:type="spellStart"/>
+      <w:r>
+        <w:rPr>
+          <w:rFonts w:ascii="Arial" w:hAnsi="Arial" w:cs="Arial"/>
+          <w:lang w:eastAsia="es-EC"/>
+        </w:rPr>
+        <w:t>analisis</w:t>
+      </w:r>
+      <w:proofErr w:type="spellEnd"/>
+      <w:r>
+        <w:rPr>
+          <w:rFonts w:ascii="Arial" w:hAnsi="Arial" w:cs="Arial"/>
+          <w:lang w:eastAsia="es-EC"/>
+        </w:rPr>
+        <w:t xml:space="preserve">-requisitos para organizar el trabajo relacionado con el análisis de requisitos. </w:t>
+      </w:r>
+    </w:p>
+    <w:p>
+      <w:pPr>
+        <w:widowControl w:val="0"/>
+        <w:pBdr>
+          <w:top w:val="nil"/>
+          <w:left w:val="nil"/>
+          <w:bottom w:val="nil"/>
+          <w:right w:val="nil"/>
+          <w:between w:val="nil"/>
+        </w:pBdr>
+        <w:spacing w:after="0" w:line="360" w:lineRule="auto"/>
+        <w:ind w:left="360"/>
+        <w:jc w:val="both"/>
+        <w:rPr>
+          <w:rFonts w:ascii="Arial" w:hAnsi="Arial" w:cs="Arial"/>
+          <w:lang w:eastAsia="es-EC"/>
+        </w:rPr>
+      </w:pPr>
+    </w:p>
+    <w:p>
+      <w:pPr>
+        <w:widowControl w:val="0"/>
+        <w:pBdr>
+          <w:top w:val="nil"/>
+          <w:left w:val="nil"/>
+          <w:bottom w:val="nil"/>
+          <w:right w:val="nil"/>
+          <w:between w:val="nil"/>
+        </w:pBdr>
+        <w:spacing w:after="0" w:line="360" w:lineRule="auto"/>
+        <w:jc w:val="both"/>
+        <w:rPr>
+          <w:rFonts w:ascii="Arial" w:hAnsi="Arial" w:cs="Arial"/>
+          <w:b/>
+          <w:bCs/>
+          <w:sz w:val="24"/>
+          <w:szCs w:val="24"/>
+          <w:lang w:eastAsia="es-EC"/>
+        </w:rPr>
+      </w:pPr>
+      <w:r>
+        <w:rPr>
+          <w:rFonts w:ascii="Arial" w:hAnsi="Arial" w:cs="Arial"/>
+          <w:b/>
+          <w:bCs/>
+          <w:sz w:val="24"/>
+          <w:szCs w:val="24"/>
+          <w:lang w:eastAsia="es-EC"/>
+        </w:rPr>
+        <w:t>C</w:t>
+      </w:r>
+      <w:r>
+        <w:rPr>
+          <w:rFonts w:ascii="Arial" w:hAnsi="Arial" w:cs="Arial"/>
+          <w:b/>
+          <w:bCs/>
+          <w:sz w:val="24"/>
+          <w:szCs w:val="24"/>
+          <w:lang w:eastAsia="es-EC"/>
+        </w:rPr>
+        <w:t>ontrol de versiones con Git y GitHub.</w:t>
+      </w:r>
+    </w:p>
+    <w:p>
+      <w:pPr>
+        <w:widowControl w:val="0"/>
+        <w:pBdr>
+          <w:top w:val="nil"/>
+          <w:left w:val="nil"/>
+          <w:bottom w:val="nil"/>
+          <w:right w:val="nil"/>
+          <w:between w:val="nil"/>
+        </w:pBdr>
+        <w:spacing w:after="0" w:line="360" w:lineRule="auto"/>
+        <w:jc w:val="both"/>
+        <w:rPr>
+          <w:rFonts w:ascii="Arial" w:hAnsi="Arial" w:cs="Arial"/>
+          <w:b/>
+          <w:bCs/>
+          <w:sz w:val="24"/>
+          <w:szCs w:val="24"/>
+          <w:lang w:eastAsia="es-EC"/>
+        </w:rPr>
+      </w:pPr>
+      <w:r>
+        <w:rPr>
+          <w:rFonts w:ascii="Arial" w:hAnsi="Arial" w:cs="Arial"/>
+          <w:b/>
+          <w:bCs/>
+          <w:sz w:val="24"/>
+          <w:szCs w:val="24"/>
+          <w:lang w:eastAsia="es-EC"/>
+        </w:rPr>
+        <w:drawing>
+          <wp:inline distT="0" distB="0" distL="0" distR="0" wp14:anchorId="2DF2ACEE" wp14:editId="26933BEF">
+            <wp:extent cx="5400040" cy="1478280"/>
+            <wp:effectExtent l="0" t="0" r="0" b="7620"/>
+            <wp:docPr id="1572379253" name="Imagen 1"/>
+            <wp:cNvGraphicFramePr>
+              <a:graphicFrameLocks xmlns:a="http://schemas.openxmlformats.org/drawingml/2006/main" noChangeAspect="1"/>
+            </wp:cNvGraphicFramePr>
+            <a:graphic xmlns:a="http://schemas.openxmlformats.org/drawingml/2006/main">
+              <a:graphicData uri="http://schemas.openxmlformats.org/drawingml/2006/picture">
+                <pic:pic xmlns:pic="http://schemas.openxmlformats.org/drawingml/2006/picture">
+                  <pic:nvPicPr>
+                    <pic:cNvPr id="1572379253" name=""/>
+                    <pic:cNvPicPr/>
+                  </pic:nvPicPr>
+                  <pic:blipFill>
+                    <a:blip r:embed="rId40"/>
+                    <a:stretch>
+                      <a:fillRect/>
+                    </a:stretch>
+                  </pic:blipFill>
+                  <pic:spPr>
+                    <a:xfrm>
+                      <a:off x="0" y="0"/>
+                      <a:ext cx="5400040" cy="1478280"/>
+                    </a:xfrm>
+                    <a:prstGeom prst="rect">
+                      <a:avLst/>
+                    </a:prstGeom>
+                  </pic:spPr>
+                </pic:pic>
+              </a:graphicData>
+            </a:graphic>
+          </wp:inline>
+        </w:drawing>
+      </w:r>
+    </w:p>
+    <w:p>
+      <w:pPr>
+        <w:widowControl w:val="0"/>
+        <w:pBdr>
+          <w:top w:val="nil"/>
+          <w:left w:val="nil"/>
+          <w:bottom w:val="nil"/>
+          <w:right w:val="nil"/>
+          <w:between w:val="nil"/>
+        </w:pBdr>
+        <w:spacing w:after="0" w:line="360" w:lineRule="auto"/>
+        <w:jc w:val="both"/>
+        <w:rPr>
+          <w:rFonts w:ascii="Arial" w:hAnsi="Arial" w:cs="Arial"/>
+          <w:lang w:eastAsia="es-EC"/>
+        </w:rPr>
+      </w:pPr>
+    </w:p>
+    <w:p>
+      <w:pPr>
+        <w:widowControl w:val="0"/>
+        <w:pBdr>
+          <w:top w:val="nil"/>
+          <w:left w:val="nil"/>
+          <w:bottom w:val="nil"/>
+          <w:right w:val="nil"/>
+          <w:between w:val="nil"/>
+        </w:pBdr>
+        <w:spacing w:after="0" w:line="360" w:lineRule="auto"/>
+        <w:jc w:val="both"/>
+        <w:rPr>
+          <w:rFonts w:ascii="Arial" w:hAnsi="Arial" w:cs="Arial"/>
+          <w:lang w:eastAsia="es-EC"/>
+        </w:rPr>
+      </w:pPr>
+      <w:r>
+        <w:rPr>
+          <w:rFonts w:ascii="Arial" w:hAnsi="Arial" w:cs="Arial"/>
+          <w:lang w:eastAsia="es-EC"/>
+        </w:rPr>
+        <w:t xml:space="preserve">La imagen muestra las ramas </w:t>
+      </w:r>
+      <w:proofErr w:type="gramStart"/>
+      <w:r>
+        <w:rPr>
+          <w:rFonts w:ascii="Arial" w:hAnsi="Arial" w:cs="Arial"/>
+          <w:lang w:eastAsia="es-EC"/>
+        </w:rPr>
+        <w:t>master</w:t>
+      </w:r>
+      <w:proofErr w:type="gramEnd"/>
+      <w:r>
+        <w:rPr>
+          <w:rFonts w:ascii="Arial" w:hAnsi="Arial" w:cs="Arial"/>
+          <w:lang w:eastAsia="es-EC"/>
+        </w:rPr>
+        <w:t>, develop y feature/</w:t>
+      </w:r>
+      <w:proofErr w:type="spellStart"/>
+      <w:r>
+        <w:rPr>
+          <w:rFonts w:ascii="Arial" w:hAnsi="Arial" w:cs="Arial"/>
+          <w:lang w:eastAsia="es-EC"/>
+        </w:rPr>
+        <w:t>analisis</w:t>
+      </w:r>
+      <w:proofErr w:type="spellEnd"/>
+      <w:r>
+        <w:rPr>
+          <w:rFonts w:ascii="Arial" w:hAnsi="Arial" w:cs="Arial"/>
+          <w:lang w:eastAsia="es-EC"/>
+        </w:rPr>
+        <w:t>-requisitos, creadas para organizar el desarrollo del sistema mediante GitFlow. También se observan sus correspondientes ramas remotas en GitHub.</w:t>
+      </w:r>
+    </w:p>
+    <w:p>
+      <w:pPr>
+        <w:widowControl w:val="0"/>
+        <w:pBdr>
+          <w:top w:val="nil"/>
+          <w:left w:val="nil"/>
+          <w:bottom w:val="nil"/>
+          <w:right w:val="nil"/>
+          <w:between w:val="nil"/>
+        </w:pBdr>
+        <w:spacing w:after="0" w:line="360" w:lineRule="auto"/>
+        <w:jc w:val="both"/>
+        <w:rPr>
+          <w:rFonts w:ascii="Arial" w:hAnsi="Arial" w:cs="Arial"/>
+          <w:lang w:eastAsia="es-EC"/>
+        </w:rPr>
+      </w:pPr>
+    </w:p>
+    <w:p>
+      <w:pPr>
+        <w:widowControl w:val="0"/>
+        <w:pBdr>
+          <w:top w:val="nil"/>
+          <w:left w:val="nil"/>
+          <w:bottom w:val="nil"/>
+          <w:right w:val="nil"/>
+          <w:between w:val="nil"/>
+        </w:pBdr>
+        <w:spacing w:after="0" w:line="360" w:lineRule="auto"/>
+        <w:jc w:val="both"/>
+        <w:rPr>
+          <w:rFonts w:ascii="Arial" w:hAnsi="Arial" w:cs="Arial"/>
+          <w:lang w:eastAsia="es-EC"/>
+        </w:rPr>
+      </w:pPr>
+      <w:r>
+        <w:rPr>
+          <w:rFonts w:ascii="Arial" w:hAnsi="Arial" w:cs="Arial"/>
+          <w:b/>
+          <w:bCs/>
+          <w:lang w:eastAsia="es-EC"/>
+        </w:rPr>
+        <w:t>Historial de commits del proyecto.</w:t>
+      </w:r>
+    </w:p>
+    <w:p>
+      <w:pPr>
+        <w:widowControl w:val="0"/>
+        <w:pBdr>
+          <w:top w:val="nil"/>
+          <w:left w:val="nil"/>
+          <w:bottom w:val="nil"/>
+          <w:right w:val="nil"/>
+          <w:between w:val="nil"/>
+        </w:pBdr>
+        <w:spacing w:after="0" w:line="360" w:lineRule="auto"/>
+        <w:jc w:val="both"/>
+        <w:rPr>
+          <w:rFonts w:ascii="Arial" w:hAnsi="Arial" w:cs="Arial"/>
+          <w:b/>
+          <w:bCs/>
+          <w:sz w:val="24"/>
+          <w:szCs w:val="24"/>
+          <w:lang w:eastAsia="es-EC"/>
+        </w:rPr>
+      </w:pPr>
+      <w:r>
+        <w:rPr>
+          <w:rFonts w:ascii="Arial" w:hAnsi="Arial" w:cs="Arial"/>
+          <w:b/>
+          <w:bCs/>
+          <w:sz w:val="24"/>
+          <w:szCs w:val="24"/>
+          <w:lang w:eastAsia="es-EC"/>
+        </w:rPr>
+        <w:drawing>
+          <wp:inline distT="0" distB="0" distL="0" distR="0" wp14:anchorId="3D265A8E" wp14:editId="3E64EC6A">
+            <wp:extent cx="5400040" cy="792480"/>
+            <wp:effectExtent l="0" t="0" r="0" b="7620"/>
+            <wp:docPr id="1238399378" name="Imagen 1"/>
+            <wp:cNvGraphicFramePr>
+              <a:graphicFrameLocks xmlns:a="http://schemas.openxmlformats.org/drawingml/2006/main" noChangeAspect="1"/>
+            </wp:cNvGraphicFramePr>
+            <a:graphic xmlns:a="http://schemas.openxmlformats.org/drawingml/2006/main">
+              <a:graphicData uri="http://schemas.openxmlformats.org/drawingml/2006/picture">
+                <pic:pic xmlns:pic="http://schemas.openxmlformats.org/drawingml/2006/picture">
+                  <pic:nvPicPr>
+                    <pic:cNvPr id="1238399378" name=""/>
+                    <pic:cNvPicPr/>
+                  </pic:nvPicPr>
+                  <pic:blipFill>
+                    <a:blip r:embed="rId41"/>
+                    <a:stretch>
+                      <a:fillRect/>
+                    </a:stretch>
+                  </pic:blipFill>
+                  <pic:spPr>
+                    <a:xfrm>
+                      <a:off x="0" y="0"/>
+                      <a:ext cx="5400040" cy="792480"/>
+                    </a:xfrm>
+                    <a:prstGeom prst="rect">
+                      <a:avLst/>
+                    </a:prstGeom>
+                  </pic:spPr>
+                </pic:pic>
+              </a:graphicData>
+            </a:graphic>
+          </wp:inline>
+        </w:drawing>
+      </w:r>
+    </w:p>
+    <w:p>
+      <w:pPr>
+        <w:pStyle w:val="NormalWeb"/>
+        <w:spacing w:line="360" w:lineRule="auto"/>
+        <w:jc w:val="both"/>
+        <w:rPr>
+          <w:rFonts w:ascii="Arial" w:eastAsiaTheme="minorHAnsi" w:hAnsi="Arial" w:cs="Arial"/>
+          <w:sz w:val="22"/>
+          <w:szCs w:val="22"/>
+        </w:rPr>
+      </w:pPr>
+      <w:r>
+        <w:rPr>
+          <w:rFonts w:ascii="Arial" w:eastAsiaTheme="minorHAnsi" w:hAnsi="Arial" w:cs="Arial"/>
+          <w:sz w:val="22"/>
+          <w:szCs w:val="22"/>
+        </w:rPr>
+        <w:t xml:space="preserve">La imagen presenta los cambios registrados mediante Git durante el desarrollo del sistema. Se observa el historial de versiones y el </w:t>
+      </w:r>
+      <w:proofErr w:type="spellStart"/>
+      <w:r>
+        <w:rPr>
+          <w:rFonts w:ascii="Arial" w:eastAsiaTheme="minorHAnsi" w:hAnsi="Arial" w:cs="Arial"/>
+          <w:sz w:val="22"/>
+          <w:szCs w:val="22"/>
+        </w:rPr>
+        <w:t>commit</w:t>
+      </w:r>
+      <w:proofErr w:type="spellEnd"/>
+      <w:r>
+        <w:rPr>
+          <w:rFonts w:ascii="Arial" w:eastAsiaTheme="minorHAnsi" w:hAnsi="Arial" w:cs="Arial"/>
+          <w:sz w:val="22"/>
+          <w:szCs w:val="22"/>
+        </w:rPr>
+        <w:t xml:space="preserve"> correspondiente a la actualización del informe con los diagramas UML y los patrones de diseño, realizado en la rama feature/</w:t>
+      </w:r>
+      <w:proofErr w:type="spellStart"/>
+      <w:r>
+        <w:rPr>
+          <w:rFonts w:ascii="Arial" w:eastAsiaTheme="minorHAnsi" w:hAnsi="Arial" w:cs="Arial"/>
+          <w:sz w:val="22"/>
+          <w:szCs w:val="22"/>
+        </w:rPr>
+        <w:t>analisis</w:t>
+      </w:r>
+      <w:proofErr w:type="spellEnd"/>
+      <w:r>
+        <w:rPr>
+          <w:rFonts w:ascii="Arial" w:eastAsiaTheme="minorHAnsi" w:hAnsi="Arial" w:cs="Arial"/>
+          <w:sz w:val="22"/>
+          <w:szCs w:val="22"/>
+        </w:rPr>
+        <w:t>-requisitos.</w:t>
+      </w:r>
+    </w:p>
+    <w:p>
+      <w:pPr>
+        <w:pStyle w:val="NormalWeb"/>
+        <w:spacing w:line="360" w:lineRule="auto"/>
+        <w:jc w:val="both"/>
+        <w:rPr>
+          <w:rFonts w:ascii="Arial" w:eastAsiaTheme="minorHAnsi" w:hAnsi="Arial" w:cs="Arial"/>
+          <w:sz w:val="22"/>
+          <w:szCs w:val="22"/>
+        </w:rPr>
+      </w:pPr>
+    </w:p>
+    <w:p>
+      <w:pPr>
+        <w:widowControl w:val="0"/>
+        <w:pBdr>
+          <w:top w:val="nil"/>
+          <w:left w:val="nil"/>
+          <w:bottom w:val="nil"/>
+          <w:right w:val="nil"/>
+          <w:between w:val="nil"/>
+        </w:pBdr>
+        <w:spacing w:after="0" w:line="360" w:lineRule="auto"/>
+        <w:jc w:val="both"/>
+        <w:rPr>
+          <w:rFonts w:ascii="Arial" w:hAnsi="Arial" w:cs="Arial"/>
+          <w:b/>
+          <w:bCs/>
+          <w:sz w:val="24"/>
+          <w:szCs w:val="24"/>
+          <w:lang w:eastAsia="es-EC"/>
+        </w:rPr>
+      </w:pPr>
+      <w:r>
+        <w:rPr>
+          <w:rFonts w:ascii="Arial" w:hAnsi="Arial" w:cs="Arial"/>
+          <w:b/>
+          <w:bCs/>
+          <w:sz w:val="24"/>
+          <w:szCs w:val="24"/>
+          <w:lang w:eastAsia="es-EC"/>
+        </w:rPr>
+        <w:t xml:space="preserve">Repositorio en Git </w:t>
+      </w:r>
+      <w:proofErr w:type="gramStart"/>
+      <w:r>
+        <w:rPr>
+          <w:rFonts w:ascii="Arial" w:hAnsi="Arial" w:cs="Arial"/>
+          <w:b/>
+          <w:bCs/>
+          <w:sz w:val="24"/>
+          <w:szCs w:val="24"/>
+          <w:lang w:eastAsia="es-EC"/>
+        </w:rPr>
+        <w:t>Hub</w:t>
+      </w:r>
+      <w:proofErr w:type="gramEnd"/>
+    </w:p>
+    <w:p>
+      <w:pPr>
+        <w:widowControl w:val="0"/>
+        <w:pBdr>
+          <w:top w:val="nil"/>
+          <w:left w:val="nil"/>
+          <w:bottom w:val="nil"/>
+          <w:right w:val="nil"/>
+          <w:between w:val="nil"/>
+        </w:pBdr>
+        <w:spacing w:after="0" w:line="360" w:lineRule="auto"/>
+        <w:jc w:val="both"/>
+        <w:rPr>
+          <w:rFonts w:ascii="Arial" w:hAnsi="Arial" w:cs="Arial"/>
+          <w:b/>
+          <w:bCs/>
+          <w:lang w:eastAsia="es-EC"/>
+        </w:rPr>
+      </w:pPr>
+      <w:r>
+        <w:rPr>
+          <w:rFonts w:ascii="Arial" w:hAnsi="Arial" w:cs="Arial"/>
+          <w:b/>
+          <w:bCs/>
+          <w:lang w:eastAsia="es-EC"/>
+        </w:rPr>
+        <w:lastRenderedPageBreak/>
+        <w:drawing>
+          <wp:inline distT="0" distB="0" distL="0" distR="0" wp14:anchorId="7F0684A4" wp14:editId="381B775F">
+            <wp:extent cx="5400040" cy="2742565"/>
+            <wp:effectExtent l="0" t="0" r="0" b="635"/>
+            <wp:docPr id="782911023" name="Imagen 1"/>
+            <wp:cNvGraphicFramePr>
+              <a:graphicFrameLocks xmlns:a="http://schemas.openxmlformats.org/drawingml/2006/main" noChangeAspect="1"/>
+            </wp:cNvGraphicFramePr>
+            <a:graphic xmlns:a="http://schemas.openxmlformats.org/drawingml/2006/main">
+              <a:graphicData uri="http://schemas.openxmlformats.org/drawingml/2006/picture">
+                <pic:pic xmlns:pic="http://schemas.openxmlformats.org/drawingml/2006/picture">
+                  <pic:nvPicPr>
+                    <pic:cNvPr id="782911023" name=""/>
+                    <pic:cNvPicPr/>
+                  </pic:nvPicPr>
+                  <pic:blipFill>
+                    <a:blip r:embed="rId42"/>
+                    <a:stretch>
+                      <a:fillRect/>
+                    </a:stretch>
+                  </pic:blipFill>
+                  <pic:spPr>
+                    <a:xfrm>
+                      <a:off x="0" y="0"/>
+                      <a:ext cx="5400040" cy="2742565"/>
+                    </a:xfrm>
+                    <a:prstGeom prst="rect">
+                      <a:avLst/>
+                    </a:prstGeom>
+                  </pic:spPr>
+                </pic:pic>
+              </a:graphicData>
+            </a:graphic>
+          </wp:inline>
+        </w:drawing>
+      </w:r>
+    </w:p>
+    <w:p>
+      <w:pPr>
+        <w:widowControl w:val="0"/>
+        <w:pBdr>
+          <w:top w:val="nil"/>
+          <w:left w:val="nil"/>
+          <w:bottom w:val="nil"/>
+          <w:right w:val="nil"/>
+          <w:between w:val="nil"/>
+        </w:pBdr>
+        <w:spacing w:after="0" w:line="360" w:lineRule="auto"/>
+        <w:jc w:val="both"/>
+        <w:rPr>
+          <w:rFonts w:ascii="Arial" w:hAnsi="Arial" w:cs="Arial"/>
+          <w:lang w:eastAsia="es-EC"/>
+        </w:rPr>
+      </w:pPr>
+      <w:r>
+        <w:rPr>
+          <w:rFonts w:ascii="Arial" w:hAnsi="Arial" w:cs="Arial"/>
+          <w:lang w:eastAsia="es-EC"/>
+        </w:rPr>
+        <w:t xml:space="preserve">La imagen muestra el repositorio público </w:t>
+      </w:r>
+      <w:r>
+        <w:rPr>
+          <w:rFonts w:ascii="Arial" w:hAnsi="Arial" w:cs="Arial"/>
+          <w:lang w:eastAsia="es-EC"/>
+        </w:rPr>
+        <w:t>de la tarea (Oña_Franklin_Act1)</w:t>
+      </w:r>
+      <w:r>
+        <w:rPr>
+          <w:rFonts w:ascii="Arial" w:hAnsi="Arial" w:cs="Arial"/>
+          <w:lang w:eastAsia="es-EC"/>
+        </w:rPr>
+        <w:t>. Se observa la rama feature/</w:t>
+      </w:r>
+      <w:proofErr w:type="spellStart"/>
+      <w:r>
+        <w:rPr>
+          <w:rFonts w:ascii="Arial" w:hAnsi="Arial" w:cs="Arial"/>
+          <w:lang w:eastAsia="es-EC"/>
+        </w:rPr>
+        <w:t>analisis</w:t>
+      </w:r>
+      <w:proofErr w:type="spellEnd"/>
+      <w:r>
+        <w:rPr>
+          <w:rFonts w:ascii="Arial" w:hAnsi="Arial" w:cs="Arial"/>
+          <w:lang w:eastAsia="es-EC"/>
+        </w:rPr>
+        <w:t xml:space="preserve">-requisitos y el registro del </w:t>
+      </w:r>
+      <w:proofErr w:type="spellStart"/>
+      <w:r>
+        <w:rPr>
+          <w:rFonts w:ascii="Arial" w:hAnsi="Arial" w:cs="Arial"/>
+          <w:lang w:eastAsia="es-EC"/>
+        </w:rPr>
+        <w:t>commit</w:t>
+      </w:r>
+      <w:proofErr w:type="spellEnd"/>
+      <w:r>
+        <w:rPr>
+          <w:rFonts w:ascii="Arial" w:hAnsi="Arial" w:cs="Arial"/>
+          <w:lang w:eastAsia="es-EC"/>
+        </w:rPr>
+        <w:t xml:space="preserve"> correspondiente a la actualización del informe, lo que evidencia el uso de GitHub para almacenar y controlar las versiones del proyecto.</w:t>
+      </w:r>
+    </w:p>
+    <w:p>
+      <w:pPr>
+        <w:widowControl w:val="0"/>
+        <w:pBdr>
+          <w:top w:val="nil"/>
+          <w:left w:val="nil"/>
+          <w:bottom w:val="nil"/>
+          <w:right w:val="nil"/>
+          <w:between w:val="nil"/>
+        </w:pBdr>
+        <w:spacing w:after="0" w:line="360" w:lineRule="auto"/>
+        <w:jc w:val="both"/>
+        <w:rPr>
+          <w:rFonts w:ascii="Arial" w:hAnsi="Arial" w:cs="Arial"/>
+          <w:lang w:eastAsia="es-EC"/>
+        </w:rPr>
+      </w:pPr>
+    </w:p>
+    <w:p>
+      <w:pPr>
+        <w:widowControl w:val="0"/>
+        <w:pBdr>
+          <w:top w:val="nil"/>
+          <w:left w:val="nil"/>
+          <w:bottom w:val="nil"/>
+          <w:right w:val="nil"/>
+          <w:between w:val="nil"/>
+        </w:pBdr>
+        <w:spacing w:after="0" w:line="360" w:lineRule="auto"/>
+        <w:jc w:val="both"/>
+        <w:rPr>
+          <w:rFonts w:ascii="Arial" w:hAnsi="Arial" w:cs="Arial"/>
+          <w:lang w:eastAsia="es-EC"/>
+        </w:rPr>
+      </w:pPr>
+      <w:r>
+        <w:rPr>
+          <w:rFonts w:ascii="Arial" w:hAnsi="Arial" w:cs="Arial"/>
+          <w:b/>
+          <w:bCs/>
+          <w:lang w:eastAsia="es-EC"/>
+        </w:rPr>
+        <w:t>Enlace del repositorio público en GitHub</w:t>
+      </w:r>
+    </w:p>
+    <w:p>
+      <w:pPr>
+        <w:widowControl w:val="0"/>
+        <w:pBdr>
+          <w:top w:val="nil"/>
+          <w:left w:val="nil"/>
+          <w:bottom w:val="nil"/>
+          <w:right w:val="nil"/>
+          <w:between w:val="nil"/>
+        </w:pBdr>
+        <w:spacing w:after="0" w:line="360" w:lineRule="auto"/>
+        <w:jc w:val="both"/>
+        <w:rPr>
+          <w:rFonts w:ascii="Arial" w:hAnsi="Arial" w:cs="Arial"/>
+          <w:lang w:eastAsia="es-EC"/>
+        </w:rPr>
+      </w:pPr>
+      <w:hyperlink r:id="rId43" w:history="1">
+        <w:r>
+          <w:rPr>
+            <w:rStyle w:val="Hipervnculo"/>
+            <w:rFonts w:ascii="Arial" w:hAnsi="Arial" w:cs="Arial"/>
+            <w:lang w:eastAsia="es-EC"/>
+          </w:rPr>
+          <w:t>https://github.com/fona0694-web/DESARROLLO-DE-SISTEMA-INFORMATICOS.git</w:t>
+        </w:r>
+      </w:hyperlink>
+      <w:r>
+        <w:rPr>
+          <w:rFonts w:ascii="Arial" w:hAnsi="Arial" w:cs="Arial"/>
+          <w:lang w:eastAsia="es-EC"/>
+        </w:rPr>
+        <w:t xml:space="preserve"> </w:t>
+      </w:r>
+    </w:p>
+    <w:p>
+      <w:pPr>
+        <w:pStyle w:val="Prrafodelista"/>
+        <w:widowControl w:val="0"/>
+        <w:pBdr>
+          <w:top w:val="nil"/>
+          <w:left w:val="nil"/>
+          <w:bottom w:val="nil"/>
+          <w:right w:val="nil"/>
+          <w:between w:val="nil"/>
+        </w:pBdr>
+        <w:spacing w:after="0" w:line="360" w:lineRule="auto"/>
+        <w:jc w:val="both"/>
+        <w:rPr>
+          <w:rFonts w:ascii="Arial" w:hAnsi="Arial" w:cs="Arial"/>
+          <w:lang w:eastAsia="es-EC"/>
+        </w:rPr>
+      </w:pPr>
+    </w:p>
+    <w:p>
+      <w:pPr>
+        <w:pStyle w:val="Prrafodelista"/>
+        <w:widowControl w:val="0"/>
+        <w:pBdr>
+          <w:top w:val="nil"/>
+          <w:left w:val="nil"/>
+          <w:bottom w:val="nil"/>
+          <w:right w:val="nil"/>
+          <w:between w:val="nil"/>
+        </w:pBdr>
+        <w:spacing w:after="0" w:line="360" w:lineRule="auto"/>
+        <w:jc w:val="both"/>
+        <w:rPr>
+          <w:rFonts w:ascii="Arial" w:hAnsi="Arial" w:cs="Arial"/>
+          <w:lang w:eastAsia="es-EC"/>
+        </w:rPr>
+      </w:pPr>
+    </w:p>
+    <w:p>
+      <w:pPr>
         <w:pStyle w:val="Sinespaciado"/>
         <w:spacing w:line="360" w:lineRule="auto"/>
         <w:jc w:val="both"/>
@@ -7689,7 +8773,198 @@
           <w:bCs/>
           <w:lang w:eastAsia="es-EC"/>
         </w:rPr>
-        <w:t>Bibliografía</w:t>
+        <w:t>E</w:t>
+      </w:r>
+      <w:r>
+        <w:rPr>
+          <w:rFonts w:ascii="Arial" w:hAnsi="Arial" w:cs="Arial"/>
+          <w:b/>
+          <w:bCs/>
+          <w:lang w:eastAsia="es-EC"/>
+        </w:rPr>
+        <w:t>videncias</w:t>
+      </w:r>
+    </w:p>
+    <w:p>
+      <w:pPr>
+        <w:widowControl w:val="0"/>
+        <w:pBdr>
+          <w:top w:val="nil"/>
+          <w:left w:val="nil"/>
+          <w:bottom w:val="nil"/>
+          <w:right w:val="nil"/>
+          <w:between w:val="nil"/>
+        </w:pBdr>
+        <w:spacing w:after="0" w:line="360" w:lineRule="auto"/>
+        <w:jc w:val="both"/>
+        <w:rPr>
+          <w:rFonts w:ascii="Arial" w:hAnsi="Arial" w:cs="Arial"/>
+          <w:lang w:eastAsia="es-EC"/>
+        </w:rPr>
+      </w:pPr>
+      <w:r>
+        <w:rPr>
+          <w:rFonts w:ascii="Arial" w:hAnsi="Arial" w:cs="Arial"/>
+          <w:lang w:eastAsia="es-EC"/>
+        </w:rPr>
+        <w:t xml:space="preserve">Enlace drive con </w:t>
+      </w:r>
+      <w:r>
+        <w:rPr>
+          <w:rFonts w:ascii="Arial" w:hAnsi="Arial" w:cs="Arial"/>
+          <w:lang w:eastAsia="es-EC"/>
+        </w:rPr>
+        <w:t xml:space="preserve">los </w:t>
+      </w:r>
+      <w:r>
+        <w:rPr>
+          <w:rFonts w:ascii="Arial" w:hAnsi="Arial" w:cs="Arial"/>
+          <w:lang w:eastAsia="es-EC"/>
+        </w:rPr>
+        <w:t>diagramas de casos de uso, clases, arquitectura del sistema y secuencia, junto con los diagramas correspondientes a los patrones de diseño Singleton, Observer y Factory Method</w:t>
+      </w:r>
+      <w:r>
+        <w:rPr>
+          <w:rFonts w:ascii="Arial" w:hAnsi="Arial" w:cs="Arial"/>
+          <w:lang w:eastAsia="es-EC"/>
+        </w:rPr>
+        <w:t xml:space="preserve"> realizados en </w:t>
+      </w:r>
+      <w:r>
+        <w:rPr>
+          <w:rFonts w:ascii="Arial" w:hAnsi="Arial" w:cs="Arial"/>
+          <w:lang w:eastAsia="es-EC"/>
+        </w:rPr>
+        <w:t>drawio.com</w:t>
+      </w:r>
+    </w:p>
+    <w:p>
+      <w:pPr>
+        <w:widowControl w:val="0"/>
+        <w:pBdr>
+          <w:top w:val="nil"/>
+          <w:left w:val="nil"/>
+          <w:bottom w:val="nil"/>
+          <w:right w:val="nil"/>
+          <w:between w:val="nil"/>
+        </w:pBdr>
+        <w:spacing w:after="0" w:line="360" w:lineRule="auto"/>
+        <w:jc w:val="both"/>
+        <w:rPr>
+          <w:rStyle w:val="Hipervnculo"/>
+          <w:lang w:eastAsia="es-EC"/>
+        </w:rPr>
+      </w:pPr>
+      <w:hyperlink r:id="rId44" w:history="1">
+        <w:r>
+          <w:rPr>
+            <w:rStyle w:val="Hipervnculo"/>
+            <w:rFonts w:ascii="Arial" w:hAnsi="Arial" w:cs="Arial"/>
+            <w:lang w:eastAsia="es-EC"/>
+          </w:rPr>
+          <w:t>https://drive.google.com/drive/folders/1CpK3h2fB9TN7p4YgmbRiBFaocdSuUZOa?usp=sharing</w:t>
+        </w:r>
+      </w:hyperlink>
+      <w:r>
+        <w:rPr>
+          <w:rStyle w:val="Hipervnculo"/>
+          <w:lang w:eastAsia="es-EC"/>
+        </w:rPr>
+        <w:t xml:space="preserve"> </w:t>
+      </w:r>
+    </w:p>
+    <w:p>
+      <w:pPr>
+        <w:widowControl w:val="0"/>
+        <w:pBdr>
+          <w:top w:val="nil"/>
+          <w:left w:val="nil"/>
+          <w:bottom w:val="nil"/>
+          <w:right w:val="nil"/>
+          <w:between w:val="nil"/>
+        </w:pBdr>
+        <w:spacing w:after="0" w:line="360" w:lineRule="auto"/>
+        <w:jc w:val="both"/>
+        <w:rPr>
+          <w:rFonts w:ascii="Arial" w:hAnsi="Arial" w:cs="Arial"/>
+          <w:b/>
+          <w:bCs/>
+          <w:lang w:eastAsia="es-EC"/>
+        </w:rPr>
+      </w:pPr>
+    </w:p>
+    <w:p>
+      <w:pPr>
+        <w:widowControl w:val="0"/>
+        <w:pBdr>
+          <w:top w:val="nil"/>
+          <w:left w:val="nil"/>
+          <w:bottom w:val="nil"/>
+          <w:right w:val="nil"/>
+          <w:between w:val="nil"/>
+        </w:pBdr>
+        <w:spacing w:after="0" w:line="360" w:lineRule="auto"/>
+        <w:jc w:val="both"/>
+        <w:rPr>
+          <w:rFonts w:ascii="Arial" w:hAnsi="Arial" w:cs="Arial"/>
+          <w:lang w:eastAsia="es-EC"/>
+        </w:rPr>
+      </w:pPr>
+      <w:r>
+        <w:rPr>
+          <w:rFonts w:ascii="Arial" w:hAnsi="Arial" w:cs="Arial"/>
+          <w:lang w:eastAsia="es-EC"/>
+        </w:rPr>
+        <w:t>Las capturas de pantalla incluidas en el informe permiten evidenciar la configuración del repositorio, la creación de ramas, el historial de commits.</w:t>
+      </w:r>
+      <w:r>
+        <w:rPr>
+          <w:rFonts w:ascii="Arial" w:hAnsi="Arial" w:cs="Arial"/>
+          <w:lang w:eastAsia="es-EC"/>
+        </w:rPr>
+        <w:t xml:space="preserve"> </w:t>
+      </w:r>
+      <w:r>
+        <w:rPr>
+          <w:rFonts w:ascii="Arial" w:hAnsi="Arial" w:cs="Arial"/>
+          <w:lang w:eastAsia="es-EC"/>
+        </w:rPr>
+        <w:t>Enlace del repositorio público en GitHub</w:t>
+      </w:r>
+    </w:p>
+    <w:p>
+      <w:pPr>
+        <w:widowControl w:val="0"/>
+        <w:pBdr>
+          <w:top w:val="nil"/>
+          <w:left w:val="nil"/>
+          <w:bottom w:val="nil"/>
+          <w:right w:val="nil"/>
+          <w:between w:val="nil"/>
+        </w:pBdr>
+        <w:spacing w:after="0" w:line="360" w:lineRule="auto"/>
+        <w:jc w:val="both"/>
+        <w:rPr>
+          <w:rFonts w:ascii="Arial" w:hAnsi="Arial" w:cs="Arial"/>
+          <w:lang w:eastAsia="es-EC"/>
+        </w:rPr>
+      </w:pPr>
+      <w:hyperlink r:id="rId45" w:history="1">
+        <w:r>
+          <w:rPr>
+            <w:rStyle w:val="Hipervnculo"/>
+            <w:rFonts w:ascii="Arial" w:hAnsi="Arial" w:cs="Arial"/>
+            <w:lang w:eastAsia="es-EC"/>
+          </w:rPr>
+          <w:t>https://github.com/fona0694-web/DESARROLLO-DE-SISTEMA-INFORMATICOS.git</w:t>
+        </w:r>
+      </w:hyperlink>
+      <w:r>
+        <w:rPr>
+          <w:rFonts w:ascii="Arial" w:hAnsi="Arial" w:cs="Arial"/>
+          <w:lang w:eastAsia="es-EC"/>
+        </w:rPr>
+        <w:t xml:space="preserve"> </w:t>
       </w:r>
     </w:p>
     <w:p>
@@ -7706,51 +8981,389 @@
         <w:jc w:val="both"/>
         <w:rPr>
           <w:rFonts w:ascii="Arial" w:hAnsi="Arial" w:cs="Arial"/>
-          <w:i/>
-          <w:iCs/>
+          <w:b/>
+          <w:bCs/>
+          <w:lang w:eastAsia="es-EC"/>
+        </w:rPr>
+      </w:pPr>
+    </w:p>
+    <w:p>
+      <w:pPr>
+        <w:widowControl w:val="0"/>
+        <w:pBdr>
+          <w:top w:val="nil"/>
+          <w:left w:val="nil"/>
+          <w:bottom w:val="nil"/>
+          <w:right w:val="nil"/>
+          <w:between w:val="nil"/>
+        </w:pBdr>
+        <w:spacing w:after="0" w:line="240" w:lineRule="auto"/>
+        <w:jc w:val="both"/>
+        <w:rPr>
+          <w:rFonts w:ascii="Arial" w:hAnsi="Arial" w:cs="Arial"/>
           <w:sz w:val="20"/>
           <w:szCs w:val="20"/>
           <w:lang w:eastAsia="es-EC"/>
         </w:rPr>
       </w:pPr>
-      <w:r>
-        <w:rPr>
-          <w:rFonts w:ascii="Arial" w:hAnsi="Arial" w:cs="Arial"/>
-          <w:i/>
-          <w:iCs/>
+    </w:p>
+    <w:p>
+      <w:pPr>
+        <w:widowControl w:val="0"/>
+        <w:pBdr>
+          <w:top w:val="nil"/>
+          <w:left w:val="nil"/>
+          <w:bottom w:val="nil"/>
+          <w:right w:val="nil"/>
+          <w:between w:val="nil"/>
+        </w:pBdr>
+        <w:spacing w:after="0" w:line="240" w:lineRule="auto"/>
+        <w:jc w:val="both"/>
+        <w:rPr>
+          <w:rFonts w:ascii="Arial" w:hAnsi="Arial" w:cs="Arial"/>
           <w:sz w:val="20"/>
           <w:szCs w:val="20"/>
           <w:lang w:eastAsia="es-EC"/>
         </w:rPr>
-        <w:t>(</w:t>
-      </w:r>
-      <w:r>
-        <w:rPr>
-          <w:rFonts w:ascii="Arial" w:hAnsi="Arial" w:cs="Arial"/>
-          <w:i/>
-          <w:iCs/>
+      </w:pPr>
+    </w:p>
+    <w:p>
+      <w:pPr>
+        <w:widowControl w:val="0"/>
+        <w:pBdr>
+          <w:top w:val="nil"/>
+          <w:left w:val="nil"/>
+          <w:bottom w:val="nil"/>
+          <w:right w:val="nil"/>
+          <w:between w:val="nil"/>
+        </w:pBdr>
+        <w:spacing w:after="0" w:line="240" w:lineRule="auto"/>
+        <w:jc w:val="both"/>
+        <w:rPr>
+          <w:rFonts w:ascii="Arial" w:hAnsi="Arial" w:cs="Arial"/>
           <w:sz w:val="20"/>
           <w:szCs w:val="20"/>
           <w:lang w:eastAsia="es-EC"/>
         </w:rPr>
-        <w:t>Referencias bibliográficas y/o enlaces en Internet (normas APA) que se utilizaron para realizar la práctica.</w:t>
-      </w:r>
-      <w:r>
-        <w:rPr>
-          <w:rFonts w:ascii="Arial" w:hAnsi="Arial" w:cs="Arial"/>
-          <w:i/>
-          <w:iCs/>
+      </w:pPr>
+    </w:p>
+    <w:sdt>
+      <w:sdtPr>
+        <w:rPr>
+          <w:lang w:val="es-ES"/>
+        </w:rPr>
+        <w:id w:val="304441126"/>
+        <w:docPartObj>
+          <w:docPartGallery w:val="Bibliographies"/>
+          <w:docPartUnique/>
+        </w:docPartObj>
+      </w:sdtPr>
+      <w:sdtEndPr>
+        <w:rPr>
+          <w:rFonts w:asciiTheme="minorHAnsi" w:eastAsiaTheme="minorHAnsi" w:hAnsiTheme="minorHAnsi" w:cstheme="minorBidi"/>
+          <w:color w:val="auto"/>
+          <w:sz w:val="22"/>
+          <w:szCs w:val="22"/>
+          <w:lang w:val="es-EC"/>
+        </w:rPr>
+      </w:sdtEndPr>
+      <w:sdtContent>
+        <w:p>
+          <w:pPr>
+            <w:pStyle w:val="Ttulo1"/>
+            <w:rPr>
+              <w:rFonts w:ascii="Arial" w:hAnsi="Arial" w:cs="Arial"/>
+              <w:b/>
+              <w:bCs/>
+              <w:color w:val="000000" w:themeColor="text1"/>
+              <w:sz w:val="24"/>
+              <w:szCs w:val="24"/>
+            </w:rPr>
+          </w:pPr>
+          <w:r>
+            <w:rPr>
+              <w:rFonts w:ascii="Arial" w:hAnsi="Arial" w:cs="Arial"/>
+              <w:b/>
+              <w:bCs/>
+              <w:color w:val="000000" w:themeColor="text1"/>
+              <w:sz w:val="24"/>
+              <w:szCs w:val="24"/>
+              <w:lang w:val="es-ES"/>
+            </w:rPr>
+            <w:t>Bibliografía</w:t>
+          </w:r>
+        </w:p>
+        <w:sdt>
+          <w:sdtPr>
+            <w:id w:val="111145805"/>
+            <w:bibliography/>
+          </w:sdtPr>
+          <w:sdtContent>
+            <w:p>
+              <w:pPr>
+                <w:rPr>
+                  <w:noProof/>
+                </w:rPr>
+              </w:pPr>
+              <w:r>
+                <w:fldChar w:fldCharType="begin"/>
+              </w:r>
+              <w:r>
+                <w:instrText>BIBLIOGRAPHY</w:instrText>
+              </w:r>
+              <w:r>
+                <w:fldChar w:fldCharType="separate"/>
+              </w:r>
+            </w:p>
+            <w:tbl>
+              <w:tblPr>
+                <w:tblW w:w="5000" w:type="pct"/>
+                <w:tblCellSpacing w:w="15" w:type="dxa"/>
+                <w:tblCellMar>
+                  <w:top w:w="15" w:type="dxa"/>
+                  <w:left w:w="15" w:type="dxa"/>
+                  <w:bottom w:w="15" w:type="dxa"/>
+                  <w:right w:w="15" w:type="dxa"/>
+                </w:tblCellMar>
+                <w:tblLook w:val="04A0" w:firstRow="1" w:lastRow="0" w:firstColumn="1" w:lastColumn="0" w:noHBand="0" w:noVBand="1"/>
+              </w:tblPr>
+              <w:tblGrid>
+                <w:gridCol w:w="322"/>
+                <w:gridCol w:w="8704"/>
+              </w:tblGrid>
+              <w:tr>
+                <w:trPr>
+                  <w:divId w:val="1146165879"/>
+                  <w:tblCellSpacing w:w="15" w:type="dxa"/>
+                </w:trPr>
+                <w:tc>
+                  <w:tcPr>
+                    <w:tcW w:w="50" w:type="pct"/>
+                    <w:hideMark/>
+                  </w:tcPr>
+                  <w:p>
+                    <w:pPr>
+                      <w:pStyle w:val="Bibliografa"/>
+                      <w:rPr>
+                        <w:noProof/>
+                        <w:sz w:val="24"/>
+                        <w:szCs w:val="24"/>
+                        <w:lang w:val="es-ES"/>
+                      </w:rPr>
+                    </w:pPr>
+                    <w:r>
+                      <w:rPr>
+                        <w:noProof/>
+                        <w:lang w:val="es-ES"/>
+                      </w:rPr>
+                      <w:t xml:space="preserve">[1] </w:t>
+                    </w:r>
+                  </w:p>
+                </w:tc>
+                <w:tc>
+                  <w:tcPr>
+                    <w:tcW w:w="0" w:type="auto"/>
+                    <w:hideMark/>
+                  </w:tcPr>
+                  <w:p>
+                    <w:pPr>
+                      <w:pStyle w:val="Bibliografa"/>
+                      <w:rPr>
+                        <w:noProof/>
+                        <w:lang w:val="en-US"/>
+                      </w:rPr>
+                    </w:pPr>
+                    <w:r>
+                      <w:rPr>
+                        <w:noProof/>
+                        <w:lang w:val="es-ES"/>
+                      </w:rPr>
+                      <w:t xml:space="preserve">S. C. &amp;. J. Long, « git-scm.com de GitHub.,» [En línea]. </w:t>
+                    </w:r>
+                    <w:r>
+                      <w:rPr>
+                        <w:noProof/>
+                        <w:lang w:val="en-US"/>
+                      </w:rPr>
+                      <w:t>Available: https://git-scm.com/install/windows.</w:t>
+                    </w:r>
+                  </w:p>
+                </w:tc>
+              </w:tr>
+              <w:tr>
+                <w:trPr>
+                  <w:divId w:val="1146165879"/>
+                  <w:tblCellSpacing w:w="15" w:type="dxa"/>
+                </w:trPr>
+                <w:tc>
+                  <w:tcPr>
+                    <w:tcW w:w="50" w:type="pct"/>
+                    <w:hideMark/>
+                  </w:tcPr>
+                  <w:p>
+                    <w:pPr>
+                      <w:pStyle w:val="Bibliografa"/>
+                      <w:rPr>
+                        <w:noProof/>
+                        <w:lang w:val="es-ES"/>
+                      </w:rPr>
+                    </w:pPr>
+                    <w:r>
+                      <w:rPr>
+                        <w:noProof/>
+                        <w:lang w:val="es-ES"/>
+                      </w:rPr>
+                      <w:t xml:space="preserve">[2] </w:t>
+                    </w:r>
+                  </w:p>
+                </w:tc>
+                <w:tc>
+                  <w:tcPr>
+                    <w:tcW w:w="0" w:type="auto"/>
+                    <w:hideMark/>
+                  </w:tcPr>
+                  <w:p>
+                    <w:pPr>
+                      <w:pStyle w:val="Bibliografa"/>
+                      <w:rPr>
+                        <w:noProof/>
+                        <w:lang w:val="en-US"/>
+                      </w:rPr>
+                    </w:pPr>
+                    <w:r>
+                      <w:rPr>
+                        <w:noProof/>
+                        <w:lang w:val="es-ES"/>
+                      </w:rPr>
+                      <w:t xml:space="preserve">I. GitHub, «GitHub, Inc,» [En línea]. </w:t>
+                    </w:r>
+                    <w:r>
+                      <w:rPr>
+                        <w:noProof/>
+                        <w:lang w:val="en-US"/>
+                      </w:rPr>
+                      <w:t>Available: https://github.com/fona0694-web/DESARROLLO-DE-SISTEMA-INFORMATICOS/tree/feature/analisis-requisitos.</w:t>
+                    </w:r>
+                  </w:p>
+                </w:tc>
+              </w:tr>
+              <w:tr>
+                <w:trPr>
+                  <w:divId w:val="1146165879"/>
+                  <w:tblCellSpacing w:w="15" w:type="dxa"/>
+                </w:trPr>
+                <w:tc>
+                  <w:tcPr>
+                    <w:tcW w:w="50" w:type="pct"/>
+                    <w:hideMark/>
+                  </w:tcPr>
+                  <w:p>
+                    <w:pPr>
+                      <w:pStyle w:val="Bibliografa"/>
+                      <w:rPr>
+                        <w:noProof/>
+                        <w:lang w:val="es-ES"/>
+                      </w:rPr>
+                    </w:pPr>
+                    <w:r>
+                      <w:rPr>
+                        <w:noProof/>
+                        <w:lang w:val="es-ES"/>
+                      </w:rPr>
+                      <w:t xml:space="preserve">[3] </w:t>
+                    </w:r>
+                  </w:p>
+                </w:tc>
+                <w:tc>
+                  <w:tcPr>
+                    <w:tcW w:w="0" w:type="auto"/>
+                    <w:hideMark/>
+                  </w:tcPr>
+                  <w:p>
+                    <w:pPr>
+                      <w:pStyle w:val="Bibliografa"/>
+                      <w:rPr>
+                        <w:noProof/>
+                        <w:lang w:val="es-ES"/>
+                      </w:rPr>
+                    </w:pPr>
+                    <w:r>
+                      <w:rPr>
+                        <w:noProof/>
+                        <w:lang w:val="es-ES"/>
+                      </w:rPr>
+                      <w:t>«dibujar.io,» [En línea]. Available: https://www.drawio.com/.</w:t>
+                    </w:r>
+                  </w:p>
+                </w:tc>
+              </w:tr>
+            </w:tbl>
+            <w:p>
+              <w:pPr>
+                <w:divId w:val="1146165879"/>
+                <w:rPr>
+                  <w:rFonts w:eastAsia="Times New Roman"/>
+                  <w:noProof/>
+                </w:rPr>
+              </w:pPr>
+            </w:p>
+            <w:p>
+              <w:r>
+                <w:rPr>
+                  <w:b/>
+                  <w:bCs/>
+                </w:rPr>
+                <w:fldChar w:fldCharType="end"/>
+              </w:r>
+            </w:p>
+          </w:sdtContent>
+        </w:sdt>
+      </w:sdtContent>
+    </w:sdt>
+    <w:p>
+      <w:pPr>
+        <w:widowControl w:val="0"/>
+        <w:pBdr>
+          <w:top w:val="nil"/>
+          <w:left w:val="nil"/>
+          <w:bottom w:val="nil"/>
+          <w:right w:val="nil"/>
+          <w:between w:val="nil"/>
+        </w:pBdr>
+        <w:spacing w:after="0" w:line="240" w:lineRule="auto"/>
+        <w:jc w:val="both"/>
+        <w:rPr>
+          <w:rFonts w:ascii="Arial" w:hAnsi="Arial" w:cs="Arial"/>
           <w:sz w:val="20"/>
           <w:szCs w:val="20"/>
           <w:lang w:eastAsia="es-EC"/>
         </w:rPr>
-        <w:t>)</w:t>
-      </w:r>
+      </w:pPr>
+    </w:p>
+    <w:p>
+      <w:pPr>
+        <w:widowControl w:val="0"/>
+        <w:pBdr>
+          <w:top w:val="nil"/>
+          <w:left w:val="nil"/>
+          <w:bottom w:val="nil"/>
+          <w:right w:val="nil"/>
+          <w:between w:val="nil"/>
+        </w:pBdr>
+        <w:spacing w:after="0" w:line="240" w:lineRule="auto"/>
+        <w:jc w:val="both"/>
+        <w:rPr>
+          <w:rFonts w:ascii="Arial" w:hAnsi="Arial" w:cs="Arial"/>
+          <w:sz w:val="20"/>
+          <w:szCs w:val="20"/>
+          <w:lang w:eastAsia="es-EC"/>
+        </w:rPr>
+      </w:pPr>
     </w:p>
     <w:sectPr>
-      <w:headerReference w:type="first" r:id="rId40"/>
+      <w:headerReference w:type="first" r:id="rId46"/>
       <w:pgSz w:w="11906" w:h="16838"/>
-      <w:pgMar w:top="1417" w:right="1701" w:bottom="1417" w:left="1701" w:header="708" w:footer="708" w:gutter="0"/>
+      <w:pgMar w:top="1440" w:right="1440" w:bottom="1440" w:left="1440" w:header="709" w:footer="709" w:gutter="0"/>
       <w:pgNumType w:start="1"/>
       <w:cols w:space="708"/>
       <w:titlePg/>
@@ -8456,7 +10069,7 @@
               <wp:inline distT="0" distB="0" distL="0" distR="0" wp14:anchorId="558DFBB3" wp14:editId="42FDF3FE">
                 <wp:extent cx="400153" cy="386664"/>
                 <wp:effectExtent l="0" t="0" r="0" b="0"/>
-                <wp:docPr id="977392058" name="Imagen 977392058"/>
+                <wp:docPr id="1768171915" name="Imagen 1768171915"/>
                 <wp:cNvGraphicFramePr/>
                 <a:graphic xmlns:a="http://schemas.openxmlformats.org/drawingml/2006/main">
                   <a:graphicData uri="http://schemas.openxmlformats.org/drawingml/2006/picture">
@@ -9194,9 +10807,9 @@
   </w:abstractNum>
   <w:abstractNum w:abstractNumId="5" w15:restartNumberingAfterBreak="0">
     <w:nsid w:val="257A7392"/>
-    <w:multiLevelType w:val="hybridMultilevel"/>
-    <w:tmpl w:val="B6DE174C"/>
-    <w:lvl w:ilvl="0" w:tplc="300A000F">
+    <w:multiLevelType w:val="multilevel"/>
+    <w:tmpl w:val="05DE8AE0"/>
+    <w:lvl w:ilvl="0">
       <w:start w:val="1"/>
       <w:numFmt w:val="decimal"/>
       <w:lvlText w:val="%1."/>
@@ -9208,77 +10821,109 @@
         <w:rFonts w:hint="default"/>
       </w:rPr>
     </w:lvl>
-    <w:lvl w:ilvl="1" w:tplc="300A0019" w:tentative="1">
-      <w:start w:val="1"/>
-      <w:numFmt w:val="lowerLetter"/>
-      <w:lvlText w:val="%2."/>
-      <w:lvlJc w:val="left"/>
-      <w:pPr>
-        <w:ind w:left="1440" w:hanging="360"/>
-      </w:pPr>
-    </w:lvl>
-    <w:lvl w:ilvl="2" w:tplc="300A001B" w:tentative="1">
-      <w:start w:val="1"/>
-      <w:numFmt w:val="lowerRoman"/>
-      <w:lvlText w:val="%3."/>
-      <w:lvlJc w:val="right"/>
-      <w:pPr>
-        <w:ind w:left="2160" w:hanging="180"/>
-      </w:pPr>
-    </w:lvl>
-    <w:lvl w:ilvl="3" w:tplc="300A000F" w:tentative="1">
+    <w:lvl w:ilvl="1">
       <w:start w:val="1"/>
       <w:numFmt w:val="decimal"/>
-      <w:lvlText w:val="%4."/>
-      <w:lvlJc w:val="left"/>
-      <w:pPr>
-        <w:ind w:left="2880" w:hanging="360"/>
-      </w:pPr>
-    </w:lvl>
-    <w:lvl w:ilvl="4" w:tplc="300A0019" w:tentative="1">
-      <w:start w:val="1"/>
-      <w:numFmt w:val="lowerLetter"/>
-      <w:lvlText w:val="%5."/>
-      <w:lvlJc w:val="left"/>
-      <w:pPr>
-        <w:ind w:left="3600" w:hanging="360"/>
-      </w:pPr>
-    </w:lvl>
-    <w:lvl w:ilvl="5" w:tplc="300A001B" w:tentative="1">
-      <w:start w:val="1"/>
-      <w:numFmt w:val="lowerRoman"/>
-      <w:lvlText w:val="%6."/>
-      <w:lvlJc w:val="right"/>
-      <w:pPr>
-        <w:ind w:left="4320" w:hanging="180"/>
-      </w:pPr>
-    </w:lvl>
-    <w:lvl w:ilvl="6" w:tplc="300A000F" w:tentative="1">
+      <w:isLgl/>
+      <w:lvlText w:val="%1.%2"/>
+      <w:lvlJc w:val="left"/>
+      <w:pPr>
+        <w:ind w:left="720" w:hanging="360"/>
+      </w:pPr>
+      <w:rPr>
+        <w:rFonts w:hint="default"/>
+      </w:rPr>
+    </w:lvl>
+    <w:lvl w:ilvl="2">
       <w:start w:val="1"/>
       <w:numFmt w:val="decimal"/>
-      <w:lvlText w:val="%7."/>
-      <w:lvlJc w:val="left"/>
-      <w:pPr>
-        <w:ind w:left="5040" w:hanging="360"/>
-      </w:pPr>
-    </w:lvl>
-    <w:lvl w:ilvl="7" w:tplc="300A0019" w:tentative="1">
-      <w:start w:val="1"/>
-      <w:numFmt w:val="lowerLetter"/>
-      <w:lvlText w:val="%8."/>
-      <w:lvlJc w:val="left"/>
-      <w:pPr>
-        <w:ind w:left="5760" w:hanging="360"/>
-      </w:pPr>
-    </w:lvl>
-    <w:lvl w:ilvl="8" w:tplc="300A001B" w:tentative="1">
-      <w:start w:val="1"/>
-      <w:numFmt w:val="lowerRoman"/>
-      <w:lvlText w:val="%9."/>
-      <w:lvlJc w:val="right"/>
-      <w:pPr>
-        <w:ind w:left="6480" w:hanging="180"/>
-      </w:pPr>
+      <w:isLgl/>
+      <w:lvlText w:val="%1.%2.%3"/>
+      <w:lvlJc w:val="left"/>
+      <w:pPr>
+        <w:ind w:left="1080" w:hanging="720"/>
+      </w:pPr>
+      <w:rPr>
+        <w:rFonts w:hint="default"/>
+      </w:rPr>
+    </w:lvl>
+    <w:lvl w:ilvl="3">
+      <w:start w:val="1"/>
+      <w:numFmt w:val="decimal"/>
+      <w:isLgl/>
+      <w:lvlText w:val="%1.%2.%3.%4"/>
+      <w:lvlJc w:val="left"/>
+      <w:pPr>
+        <w:ind w:left="1080" w:hanging="720"/>
+      </w:pPr>
+      <w:rPr>
+        <w:rFonts w:hint="default"/>
+      </w:rPr>
+    </w:lvl>
+    <w:lvl w:ilvl="4">
+      <w:start w:val="1"/>
+      <w:numFmt w:val="decimal"/>
+      <w:isLgl/>
+      <w:lvlText w:val="%1.%2.%3.%4.%5"/>
+      <w:lvlJc w:val="left"/>
+      <w:pPr>
+        <w:ind w:left="1440" w:hanging="1080"/>
+      </w:pPr>
+      <w:rPr>
+        <w:rFonts w:hint="default"/>
+      </w:rPr>
+    </w:lvl>
+    <w:lvl w:ilvl="5">
+      <w:start w:val="1"/>
+      <w:numFmt w:val="decimal"/>
+      <w:isLgl/>
+      <w:lvlText w:val="%1.%2.%3.%4.%5.%6"/>
+      <w:lvlJc w:val="left"/>
+      <w:pPr>
+        <w:ind w:left="1440" w:hanging="1080"/>
+      </w:pPr>
+      <w:rPr>
+        <w:rFonts w:hint="default"/>
+      </w:rPr>
+    </w:lvl>
+    <w:lvl w:ilvl="6">
+      <w:start w:val="1"/>
+      <w:numFmt w:val="decimal"/>
+      <w:isLgl/>
+      <w:lvlText w:val="%1.%2.%3.%4.%5.%6.%7"/>
+      <w:lvlJc w:val="left"/>
+      <w:pPr>
+        <w:ind w:left="1800" w:hanging="1440"/>
+      </w:pPr>
+      <w:rPr>
+        <w:rFonts w:hint="default"/>
+      </w:rPr>
+    </w:lvl>
+    <w:lvl w:ilvl="7">
+      <w:start w:val="1"/>
+      <w:numFmt w:val="decimal"/>
+      <w:isLgl/>
+      <w:lvlText w:val="%1.%2.%3.%4.%5.%6.%7.%8"/>
+      <w:lvlJc w:val="left"/>
+      <w:pPr>
+        <w:ind w:left="1800" w:hanging="1440"/>
+      </w:pPr>
+      <w:rPr>
+        <w:rFonts w:hint="default"/>
+      </w:rPr>
+    </w:lvl>
+    <w:lvl w:ilvl="8">
+      <w:start w:val="1"/>
+      <w:numFmt w:val="decimal"/>
+      <w:isLgl/>
+      <w:lvlText w:val="%1.%2.%3.%4.%5.%6.%7.%8.%9"/>
+      <w:lvlJc w:val="left"/>
+      <w:pPr>
+        <w:ind w:left="2160" w:hanging="1800"/>
+      </w:pPr>
+      <w:rPr>
+        <w:rFonts w:hint="default"/>
+      </w:rPr>
     </w:lvl>
   </w:abstractNum>
   <w:abstractNum w:abstractNumId="6" w15:restartNumberingAfterBreak="0">
@@ -10596,6 +12241,119 @@
     </w:lvl>
   </w:abstractNum>
   <w:abstractNum w:abstractNumId="17" w15:restartNumberingAfterBreak="0">
+    <w:nsid w:val="5E2E44DD"/>
+    <w:multiLevelType w:val="hybridMultilevel"/>
+    <w:tmpl w:val="41DA9E4A"/>
+    <w:lvl w:ilvl="0" w:tplc="300A0001">
+      <w:start w:val="1"/>
+      <w:numFmt w:val="bullet"/>
+      <w:lvlText w:val=""/>
+      <w:lvlJc w:val="left"/>
+      <w:pPr>
+        <w:ind w:left="720" w:hanging="360"/>
+      </w:pPr>
+      <w:rPr>
+        <w:rFonts w:ascii="Symbol" w:hAnsi="Symbol" w:hint="default"/>
+      </w:rPr>
+    </w:lvl>
+    <w:lvl w:ilvl="1" w:tplc="300A0003" w:tentative="1">
+      <w:start w:val="1"/>
+      <w:numFmt w:val="bullet"/>
+      <w:lvlText w:val="o"/>
+      <w:lvlJc w:val="left"/>
+      <w:pPr>
+        <w:ind w:left="1440" w:hanging="360"/>
+      </w:pPr>
+      <w:rPr>
+        <w:rFonts w:ascii="Courier New" w:hAnsi="Courier New" w:cs="Courier New" w:hint="default"/>
+      </w:rPr>
+    </w:lvl>
+    <w:lvl w:ilvl="2" w:tplc="300A0005" w:tentative="1">
+      <w:start w:val="1"/>
+      <w:numFmt w:val="bullet"/>
+      <w:lvlText w:val=""/>
+      <w:lvlJc w:val="left"/>
+      <w:pPr>
+        <w:ind w:left="2160" w:hanging="360"/>
+      </w:pPr>
+      <w:rPr>
+        <w:rFonts w:ascii="Wingdings" w:hAnsi="Wingdings" w:hint="default"/>
+      </w:rPr>
+    </w:lvl>
+    <w:lvl w:ilvl="3" w:tplc="300A0001" w:tentative="1">
+      <w:start w:val="1"/>
+      <w:numFmt w:val="bullet"/>
+      <w:lvlText w:val=""/>
+      <w:lvlJc w:val="left"/>
+      <w:pPr>
+        <w:ind w:left="2880" w:hanging="360"/>
+      </w:pPr>
+      <w:rPr>
+        <w:rFonts w:ascii="Symbol" w:hAnsi="Symbol" w:hint="default"/>
+      </w:rPr>
+    </w:lvl>
+    <w:lvl w:ilvl="4" w:tplc="300A0003" w:tentative="1">
+      <w:start w:val="1"/>
+      <w:numFmt w:val="bullet"/>
+      <w:lvlText w:val="o"/>
+      <w:lvlJc w:val="left"/>
+      <w:pPr>
+        <w:ind w:left="3600" w:hanging="360"/>
+      </w:pPr>
+      <w:rPr>
+        <w:rFonts w:ascii="Courier New" w:hAnsi="Courier New" w:cs="Courier New" w:hint="default"/>
+      </w:rPr>
+    </w:lvl>
+    <w:lvl w:ilvl="5" w:tplc="300A0005" w:tentative="1">
+      <w:start w:val="1"/>
+      <w:numFmt w:val="bullet"/>
+      <w:lvlText w:val=""/>
+      <w:lvlJc w:val="left"/>
+      <w:pPr>
+        <w:ind w:left="4320" w:hanging="360"/>
+      </w:pPr>
+      <w:rPr>
+        <w:rFonts w:ascii="Wingdings" w:hAnsi="Wingdings" w:hint="default"/>
+      </w:rPr>
+    </w:lvl>
+    <w:lvl w:ilvl="6" w:tplc="300A0001" w:tentative="1">
+      <w:start w:val="1"/>
+      <w:numFmt w:val="bullet"/>
+      <w:lvlText w:val=""/>
+      <w:lvlJc w:val="left"/>
+      <w:pPr>
+        <w:ind w:left="5040" w:hanging="360"/>
+      </w:pPr>
+      <w:rPr>
+        <w:rFonts w:ascii="Symbol" w:hAnsi="Symbol" w:hint="default"/>
+      </w:rPr>
+    </w:lvl>
+    <w:lvl w:ilvl="7" w:tplc="300A0003" w:tentative="1">
+      <w:start w:val="1"/>
+      <w:numFmt w:val="bullet"/>
+      <w:lvlText w:val="o"/>
+      <w:lvlJc w:val="left"/>
+      <w:pPr>
+        <w:ind w:left="5760" w:hanging="360"/>
+      </w:pPr>
+      <w:rPr>
+        <w:rFonts w:ascii="Courier New" w:hAnsi="Courier New" w:cs="Courier New" w:hint="default"/>
+      </w:rPr>
+    </w:lvl>
+    <w:lvl w:ilvl="8" w:tplc="300A0005" w:tentative="1">
+      <w:start w:val="1"/>
+      <w:numFmt w:val="bullet"/>
+      <w:lvlText w:val=""/>
+      <w:lvlJc w:val="left"/>
+      <w:pPr>
+        <w:ind w:left="6480" w:hanging="360"/>
+      </w:pPr>
+      <w:rPr>
+        <w:rFonts w:ascii="Wingdings" w:hAnsi="Wingdings" w:hint="default"/>
+      </w:rPr>
+    </w:lvl>
+  </w:abstractNum>
+  <w:abstractNum w:abstractNumId="18" w15:restartNumberingAfterBreak="0">
     <w:nsid w:val="68E15795"/>
     <w:multiLevelType w:val="hybridMultilevel"/>
     <w:tmpl w:val="8FE616A0"/>
@@ -10708,7 +12466,7 @@
       </w:rPr>
     </w:lvl>
   </w:abstractNum>
-  <w:abstractNum w:abstractNumId="18" w15:restartNumberingAfterBreak="0">
+  <w:abstractNum w:abstractNumId="19" w15:restartNumberingAfterBreak="0">
     <w:nsid w:val="6AFC07D3"/>
     <w:multiLevelType w:val="multilevel"/>
     <w:tmpl w:val="B3426C00"/>
@@ -10821,7 +12579,7 @@
       </w:rPr>
     </w:lvl>
   </w:abstractNum>
-  <w:abstractNum w:abstractNumId="19" w15:restartNumberingAfterBreak="0">
+  <w:abstractNum w:abstractNumId="20" w15:restartNumberingAfterBreak="0">
     <w:nsid w:val="6B7B1E92"/>
     <w:multiLevelType w:val="multilevel"/>
     <w:tmpl w:val="21BA233E"/>
@@ -10952,7 +12710,7 @@
       </w:rPr>
     </w:lvl>
   </w:abstractNum>
-  <w:abstractNum w:abstractNumId="20" w15:restartNumberingAfterBreak="0">
+  <w:abstractNum w:abstractNumId="21" w15:restartNumberingAfterBreak="0">
     <w:nsid w:val="6FA144D3"/>
     <w:multiLevelType w:val="multilevel"/>
     <w:tmpl w:val="98CEB7D6"/>
@@ -11073,7 +12831,7 @@
       </w:rPr>
     </w:lvl>
   </w:abstractNum>
-  <w:abstractNum w:abstractNumId="21" w15:restartNumberingAfterBreak="0">
+  <w:abstractNum w:abstractNumId="22" w15:restartNumberingAfterBreak="0">
     <w:nsid w:val="738344F2"/>
     <w:multiLevelType w:val="hybridMultilevel"/>
     <w:tmpl w:val="C4E037F2"/>
@@ -11188,7 +12946,7 @@
       </w:rPr>
     </w:lvl>
   </w:abstractNum>
-  <w:abstractNum w:abstractNumId="22" w15:restartNumberingAfterBreak="0">
+  <w:abstractNum w:abstractNumId="23" w15:restartNumberingAfterBreak="0">
     <w:nsid w:val="74B1685F"/>
     <w:multiLevelType w:val="hybridMultilevel"/>
     <w:tmpl w:val="943E89B2"/>
@@ -11301,7 +13059,7 @@
       </w:rPr>
     </w:lvl>
   </w:abstractNum>
-  <w:abstractNum w:abstractNumId="23" w15:restartNumberingAfterBreak="0">
+  <w:abstractNum w:abstractNumId="24" w15:restartNumberingAfterBreak="0">
     <w:nsid w:val="75DB1EAD"/>
     <w:multiLevelType w:val="multilevel"/>
     <w:tmpl w:val="F2B0D608"/>
@@ -11414,7 +13172,7 @@
       </w:rPr>
     </w:lvl>
   </w:abstractNum>
-  <w:abstractNum w:abstractNumId="24" w15:restartNumberingAfterBreak="0">
+  <w:abstractNum w:abstractNumId="25" w15:restartNumberingAfterBreak="0">
     <w:nsid w:val="77694BC3"/>
     <w:multiLevelType w:val="hybridMultilevel"/>
     <w:tmpl w:val="8D0A3582"/>
@@ -11527,7 +13285,7 @@
       </w:rPr>
     </w:lvl>
   </w:abstractNum>
-  <w:abstractNum w:abstractNumId="25" w15:restartNumberingAfterBreak="0">
+  <w:abstractNum w:abstractNumId="26" w15:restartNumberingAfterBreak="0">
     <w:nsid w:val="7CE94054"/>
     <w:multiLevelType w:val="multilevel"/>
     <w:tmpl w:val="A4D4C1F2"/>
@@ -11645,28 +13403,28 @@
     <w:abstractNumId w:val="9"/>
   </w:num>
   <w:num w:numId="2" w16cid:durableId="858279147">
+    <w:abstractNumId w:val="22"/>
+  </w:num>
+  <w:num w:numId="3" w16cid:durableId="511144400">
     <w:abstractNumId w:val="21"/>
   </w:num>
-  <w:num w:numId="3" w16cid:durableId="511144400">
-    <w:abstractNumId w:val="20"/>
-  </w:num>
   <w:num w:numId="4" w16cid:durableId="1166096731">
-    <w:abstractNumId w:val="18"/>
+    <w:abstractNumId w:val="19"/>
   </w:num>
   <w:num w:numId="5" w16cid:durableId="233855295">
-    <w:abstractNumId w:val="25"/>
+    <w:abstractNumId w:val="26"/>
   </w:num>
   <w:num w:numId="6" w16cid:durableId="307588135">
     <w:abstractNumId w:val="14"/>
   </w:num>
   <w:num w:numId="7" w16cid:durableId="40859906">
-    <w:abstractNumId w:val="19"/>
+    <w:abstractNumId w:val="20"/>
   </w:num>
   <w:num w:numId="8" w16cid:durableId="1397364658">
-    <w:abstractNumId w:val="23"/>
+    <w:abstractNumId w:val="24"/>
   </w:num>
   <w:num w:numId="9" w16cid:durableId="92753685">
-    <w:abstractNumId w:val="24"/>
+    <w:abstractNumId w:val="25"/>
   </w:num>
   <w:num w:numId="10" w16cid:durableId="159464525">
     <w:abstractNumId w:val="3"/>
@@ -11687,10 +13445,10 @@
     <w:abstractNumId w:val="2"/>
   </w:num>
   <w:num w:numId="16" w16cid:durableId="675572292">
-    <w:abstractNumId w:val="22"/>
+    <w:abstractNumId w:val="23"/>
   </w:num>
   <w:num w:numId="17" w16cid:durableId="160321026">
-    <w:abstractNumId w:val="17"/>
+    <w:abstractNumId w:val="18"/>
   </w:num>
   <w:num w:numId="18" w16cid:durableId="913777804">
     <w:abstractNumId w:val="4"/>
@@ -11716,7 +13474,10 @@
   <w:num w:numId="25" w16cid:durableId="2140802893">
     <w:abstractNumId w:val="10"/>
   </w:num>
-  <w:num w:numId="26" w16cid:durableId="1850026296">
+  <w:num w:numId="26" w16cid:durableId="1488203901">
+    <w:abstractNumId w:val="17"/>
+  </w:num>
+  <w:num w:numId="27" w16cid:durableId="1850026296">
     <w:abstractNumId w:val="0"/>
   </w:num>
 </w:numbering>
@@ -12211,7 +13972,6 @@
   <w:style w:type="character" w:default="1" w:styleId="Fuentedeprrafopredeter">
     <w:name w:val="Default Paragraph Font"/>
     <w:uiPriority w:val="1"/>
-    <w:semiHidden/>
     <w:unhideWhenUsed/>
   </w:style>
   <w:style w:type="table" w:default="1" w:styleId="Tablanormal">
@@ -12709,6 +14469,26 @@
       </w:tblBorders>
     </w:tblPr>
   </w:style>
+  <w:style w:type="character" w:styleId="Mencinsinresolver">
+    <w:name w:val="Unresolved Mention"/>
+    <w:basedOn w:val="Fuentedeprrafopredeter"/>
+    <w:uiPriority w:val="99"/>
+    <w:semiHidden/>
+    <w:unhideWhenUsed/>
+    <w:rsid w:val="00F00F25"/>
+    <w:rPr>
+      <w:color w:val="605E5C"/>
+      <w:shd w:val="clear" w:color="auto" w:fill="E1DFDD"/>
+    </w:rPr>
+  </w:style>
+  <w:style w:type="paragraph" w:styleId="Bibliografa">
+    <w:name w:val="Bibliography"/>
+    <w:basedOn w:val="Normal"/>
+    <w:next w:val="Normal"/>
+    <w:uiPriority w:val="37"/>
+    <w:unhideWhenUsed/>
+    <w:rsid w:val="00E44F1F"/>
+  </w:style>
 </w:styles>
 </file>
 
@@ -13008,11 +14788,57 @@
 </file>
 
 <file path=customXml/item1.xml><?xml version="1.0" encoding="utf-8"?>
-<b:Sources xmlns:b="http://schemas.openxmlformats.org/officeDocument/2006/bibliography" xmlns="http://schemas.openxmlformats.org/officeDocument/2006/bibliography" SelectedStyle="\APASixthEditionOfficeOnline.xsl" StyleName="APA" Version="6"/>
+<b:Sources xmlns:b="http://schemas.openxmlformats.org/officeDocument/2006/bibliography" xmlns="http://schemas.openxmlformats.org/officeDocument/2006/bibliography" SelectedStyle="\IEEE2006OfficeOnline.xsl" StyleName="IEEE" Version="2006">
+  <b:Source>
+    <b:Tag>Sco</b:Tag>
+    <b:SourceType>InternetSite</b:SourceType>
+    <b:Guid>{08798EF9-ADF6-4785-8C82-BEF90ACF518B}</b:Guid>
+    <b:Author>
+      <b:Author>
+        <b:NameList>
+          <b:Person>
+            <b:Last>Long</b:Last>
+            <b:First>Scott</b:First>
+            <b:Middle>Chacon &amp; Jason</b:Middle>
+          </b:Person>
+        </b:NameList>
+      </b:Author>
+    </b:Author>
+    <b:URL>https://git-scm.com/install/windows</b:URL>
+    <b:Title> git-scm.com de GitHub.</b:Title>
+    <b:RefOrder>1</b:RefOrder>
+  </b:Source>
+  <b:Source>
+    <b:Tag>Git</b:Tag>
+    <b:SourceType>InternetSite</b:SourceType>
+    <b:Guid>{6C09FED0-879B-44DB-A887-2D7C0836B91C}</b:Guid>
+    <b:Author>
+      <b:Author>
+        <b:NameList>
+          <b:Person>
+            <b:Last>GitHub</b:Last>
+            <b:First>Inc</b:First>
+          </b:Person>
+        </b:NameList>
+      </b:Author>
+    </b:Author>
+    <b:Title>GitHub, Inc</b:Title>
+    <b:URL>https://github.com/fona0694-web/DESARROLLO-DE-SISTEMA-INFORMATICOS/tree/feature/analisis-requisitos</b:URL>
+    <b:RefOrder>2</b:RefOrder>
+  </b:Source>
+  <b:Source>
+    <b:Tag>dib</b:Tag>
+    <b:SourceType>InternetSite</b:SourceType>
+    <b:Guid>{FC1C2188-FC4B-417A-AD23-2580A1AA1BED}</b:Guid>
+    <b:Title>dibujar.io</b:Title>
+    <b:URL>https://www.drawio.com/</b:URL>
+    <b:RefOrder>3</b:RefOrder>
+  </b:Source>
+</b:Sources>
 </file>
 
 <file path=customXml/itemProps1.xml><?xml version="1.0" encoding="utf-8"?>
-<ds:datastoreItem xmlns:ds="http://schemas.openxmlformats.org/officeDocument/2006/customXml" ds:itemID="{D9E36EB3-478D-4CDA-A55D-379463D8CF0B}">
+<ds:datastoreItem xmlns:ds="http://schemas.openxmlformats.org/officeDocument/2006/customXml" ds:itemID="{CEEE4404-82EF-43D8-AEC6-9C714EE4D024}">
   <ds:schemaRefs>
     <ds:schemaRef ds:uri="http://schemas.openxmlformats.org/officeDocument/2006/bibliography"/>
   </ds:schemaRefs>

</xml_diff>